<commit_message>
kreiranje zahteva i ponuda dodato
</commit_message>
<xml_diff>
--- a/predlog rešenja.docx
+++ b/predlog rešenja.docx
@@ -50,7 +50,7 @@
                     </pic:cNvPicPr>
                   </pic:nvPicPr>
                   <pic:blipFill>
-                    <a:blip r:embed="rId7" cstate="print">
+                    <a:blip r:embed="rId8" cstate="print">
                       <a:extLst>
                         <a:ext uri="{28A0092B-C50C-407E-A947-70E740481C1C}">
                           <a14:useLocalDpi xmlns:a14="http://schemas.microsoft.com/office/drawing/2010/main" val="0"/>
@@ -1091,7 +1091,7 @@
                     </pic:cNvPicPr>
                   </pic:nvPicPr>
                   <pic:blipFill>
-                    <a:blip r:embed="rId8">
+                    <a:blip r:embed="rId9">
                       <a:extLst>
                         <a:ext uri="{28A0092B-C50C-407E-A947-70E740481C1C}">
                           <a14:useLocalDpi xmlns:a14="http://schemas.microsoft.com/office/drawing/2010/main" val="0"/>
@@ -1476,7 +1476,7 @@
                     <pic:cNvPicPr/>
                   </pic:nvPicPr>
                   <pic:blipFill>
-                    <a:blip r:embed="rId9"/>
+                    <a:blip r:embed="rId10"/>
                     <a:stretch>
                       <a:fillRect/>
                     </a:stretch>
@@ -1660,7 +1660,7 @@
                     </pic:cNvPicPr>
                   </pic:nvPicPr>
                   <pic:blipFill>
-                    <a:blip r:embed="rId10">
+                    <a:blip r:embed="rId11">
                       <a:extLst>
                         <a:ext uri="{28A0092B-C50C-407E-A947-70E740481C1C}">
                           <a14:useLocalDpi xmlns:a14="http://schemas.microsoft.com/office/drawing/2010/main" val="0"/>
@@ -1915,7 +1915,7 @@
                     </pic:cNvPicPr>
                   </pic:nvPicPr>
                   <pic:blipFill>
-                    <a:blip r:embed="rId11">
+                    <a:blip r:embed="rId12">
                       <a:extLst>
                         <a:ext uri="{28A0092B-C50C-407E-A947-70E740481C1C}">
                           <a14:useLocalDpi xmlns:a14="http://schemas.microsoft.com/office/drawing/2010/main" val="0"/>
@@ -2196,7 +2196,7 @@
                     </pic:cNvPicPr>
                   </pic:nvPicPr>
                   <pic:blipFill>
-                    <a:blip r:embed="rId12">
+                    <a:blip r:embed="rId13">
                       <a:extLst>
                         <a:ext uri="{28A0092B-C50C-407E-A947-70E740481C1C}">
                           <a14:useLocalDpi xmlns:a14="http://schemas.microsoft.com/office/drawing/2010/main" val="0"/>
@@ -2585,7 +2585,7 @@
                     </pic:cNvPicPr>
                   </pic:nvPicPr>
                   <pic:blipFill>
-                    <a:blip r:embed="rId13">
+                    <a:blip r:embed="rId14">
                       <a:extLst>
                         <a:ext uri="{28A0092B-C50C-407E-A947-70E740481C1C}">
                           <a14:useLocalDpi xmlns:a14="http://schemas.microsoft.com/office/drawing/2010/main" val="0"/>
@@ -2899,7 +2899,7 @@
                     </pic:cNvPicPr>
                   </pic:nvPicPr>
                   <pic:blipFill>
-                    <a:blip r:embed="rId14">
+                    <a:blip r:embed="rId15">
                       <a:extLst>
                         <a:ext uri="{28A0092B-C50C-407E-A947-70E740481C1C}">
                           <a14:useLocalDpi xmlns:a14="http://schemas.microsoft.com/office/drawing/2010/main" val="0"/>
@@ -3174,7 +3174,7 @@
                     </pic:cNvPicPr>
                   </pic:nvPicPr>
                   <pic:blipFill>
-                    <a:blip r:embed="rId15">
+                    <a:blip r:embed="rId16">
                       <a:extLst>
                         <a:ext uri="{28A0092B-C50C-407E-A947-70E740481C1C}">
                           <a14:useLocalDpi xmlns:a14="http://schemas.microsoft.com/office/drawing/2010/main" val="0"/>
@@ -3579,7 +3579,7 @@
                     </pic:cNvPicPr>
                   </pic:nvPicPr>
                   <pic:blipFill>
-                    <a:blip r:embed="rId16">
+                    <a:blip r:embed="rId17">
                       <a:extLst>
                         <a:ext uri="{28A0092B-C50C-407E-A947-70E740481C1C}">
                           <a14:useLocalDpi xmlns:a14="http://schemas.microsoft.com/office/drawing/2010/main" val="0"/>
@@ -3846,57 +3846,14 @@
           <w:sz w:val="24"/>
           <w:szCs w:val="24"/>
         </w:rPr>
-        <w:t>Nakon prikaza procesa prodaje na kontekstnom nivou (A-0), izvršena je njegova dekompozicija na prvom nivou, čime je dobijen detaljniji prikaz aktivnosti koje čine ovaj proces.</w:t>
-      </w:r>
-      <w:r>
-        <w:rPr>
-          <w:rFonts w:eastAsia="Times New Roman" w:cstheme="minorHAnsi"/>
-          <w:sz w:val="24"/>
-          <w:szCs w:val="24"/>
-        </w:rPr>
-        <w:t xml:space="preserve"> </w:t>
-      </w:r>
-      <w:r>
-        <w:rPr>
-          <w:sz w:val="24"/>
-          <w:szCs w:val="24"/>
-        </w:rPr>
-        <w:t>P</w:t>
-      </w:r>
-      <w:r>
-        <w:rPr>
-          <w:sz w:val="24"/>
-          <w:szCs w:val="24"/>
-        </w:rPr>
-        <w:t>roces</w:t>
-      </w:r>
-      <w:r>
-        <w:rPr>
-          <w:sz w:val="24"/>
-          <w:szCs w:val="24"/>
-        </w:rPr>
-        <w:t xml:space="preserve"> </w:t>
-      </w:r>
-      <w:r>
-        <w:rPr>
-          <w:sz w:val="24"/>
-          <w:szCs w:val="24"/>
-        </w:rPr>
-        <w:t>prodaje transportnih usluga</w:t>
-      </w:r>
-      <w:r>
-        <w:rPr>
-          <w:sz w:val="24"/>
-          <w:szCs w:val="24"/>
-        </w:rPr>
-        <w:t xml:space="preserve"> je razložen</w:t>
-      </w:r>
-      <w:r>
-        <w:rPr>
-          <w:sz w:val="24"/>
-          <w:szCs w:val="24"/>
-        </w:rPr>
-        <w:t xml:space="preserve"> na osnovne funkcije prijema zahteva, provere dostupnosti resursa, kreiranja ponude, obrade rezervacije i realizacije ture, pri čemu su funkcije povezane odgovarajućim ulazima i izlazima, uz uticaj kontrolnih faktora i korišćenje potrebnih resursa. Podaci o realizaciji prodaje koriste se za izradu analize uspešnosti, koja predstavlja kontrolni faktor za unapređenje budućih aktivnosti, naročito u procesu kreiranja ponude</w:t>
+        <w:t xml:space="preserve">Nakon prikaza procesa prodaje na kontekstnom nivou (A-0), izvršena je njegova dekompozicija na prvom nivou, čime je dobijen detaljniji prikaz aktivnosti koje čine ovaj proces. </w:t>
+      </w:r>
+      <w:r>
+        <w:rPr>
+          <w:sz w:val="24"/>
+          <w:szCs w:val="24"/>
+        </w:rPr>
+        <w:t>Proces prodaje transportnih usluga je razložen na osnovne funkcije prijema zahteva, provere dostupnosti resursa, kreiranja ponude, obrade rezervacije i realizacije ture, pri čemu su funkcije povezane odgovarajućim ulazima i izlazima, uz uticaj kontrolnih faktora i korišćenje potrebnih resursa. Podaci o realizaciji prodaje koriste se za izradu analize uspešnosti, koja predstavlja kontrolni faktor za unapređenje budućih aktivnosti, naročito u procesu kreiranja ponude</w:t>
       </w:r>
     </w:p>
     <w:p>
@@ -4010,16 +3967,7 @@
                               <w:jc w:val="both"/>
                             </w:pPr>
                             <w:r>
-                              <w:t xml:space="preserve">Slika </w:t>
-                            </w:r>
-                            <w:r>
-                              <w:t>10</w:t>
-                            </w:r>
-                            <w:r>
-                              <w:t xml:space="preserve">. dekompozicija </w:t>
-                            </w:r>
-                            <w:r>
-                              <w:t>IDEF0</w:t>
+                              <w:t>Slika 10. dekompozicija IDEF0</w:t>
                             </w:r>
                           </w:p>
                         </w:txbxContent>
@@ -4049,16 +3997,7 @@
                         <w:jc w:val="both"/>
                       </w:pPr>
                       <w:r>
-                        <w:t xml:space="preserve">Slika </w:t>
-                      </w:r>
-                      <w:r>
-                        <w:t>10</w:t>
-                      </w:r>
-                      <w:r>
-                        <w:t xml:space="preserve">. dekompozicija </w:t>
-                      </w:r>
-                      <w:r>
-                        <w:t>IDEF0</w:t>
+                        <w:t>Slika 10. dekompozicija IDEF0</w:t>
                       </w:r>
                     </w:p>
                   </w:txbxContent>
@@ -4099,7 +4038,7 @@
                     </pic:cNvPicPr>
                   </pic:nvPicPr>
                   <pic:blipFill>
-                    <a:blip r:embed="rId17">
+                    <a:blip r:embed="rId18">
                       <a:extLst>
                         <a:ext uri="{28A0092B-C50C-407E-A947-70E740481C1C}">
                           <a14:useLocalDpi xmlns:a14="http://schemas.microsoft.com/office/drawing/2010/main" val="0"/>
@@ -4369,16 +4308,7 @@
                               <w:jc w:val="center"/>
                             </w:pPr>
                             <w:r>
-                              <w:t>Slika 1</w:t>
-                            </w:r>
-                            <w:r>
-                              <w:t>1</w:t>
-                            </w:r>
-                            <w:r>
-                              <w:t xml:space="preserve">. </w:t>
-                            </w:r>
-                            <w:r>
-                              <w:t>MOV dijagram</w:t>
+                              <w:t>Slika 11. MOV dijagram</w:t>
                             </w:r>
                           </w:p>
                         </w:txbxContent>
@@ -4408,16 +4338,7 @@
                         <w:jc w:val="center"/>
                       </w:pPr>
                       <w:r>
-                        <w:t>Slika 1</w:t>
-                      </w:r>
-                      <w:r>
-                        <w:t>1</w:t>
-                      </w:r>
-                      <w:r>
-                        <w:t xml:space="preserve">. </w:t>
-                      </w:r>
-                      <w:r>
-                        <w:t>MOV dijagram</w:t>
+                        <w:t>Slika 11. MOV dijagram</w:t>
                       </w:r>
                     </w:p>
                   </w:txbxContent>
@@ -4458,7 +4379,7 @@
                     </pic:cNvPicPr>
                   </pic:nvPicPr>
                   <pic:blipFill>
-                    <a:blip r:embed="rId18">
+                    <a:blip r:embed="rId19">
                       <a:extLst>
                         <a:ext uri="{28A0092B-C50C-407E-A947-70E740481C1C}">
                           <a14:useLocalDpi xmlns:a14="http://schemas.microsoft.com/office/drawing/2010/main" val="0"/>
@@ -4557,19 +4478,7 @@
         <w:rPr>
           <w:rFonts w:asciiTheme="minorHAnsi" w:hAnsiTheme="minorHAnsi" w:cstheme="minorHAnsi"/>
         </w:rPr>
-        <w:t>Predložena aplikacija namenjena je podršci procesu prodaje transportnih usluga u okviru sistema MPM Transport.</w:t>
-      </w:r>
-      <w:r>
-        <w:rPr>
-          <w:rFonts w:asciiTheme="minorHAnsi" w:hAnsiTheme="minorHAnsi" w:cstheme="minorHAnsi"/>
-        </w:rPr>
-        <w:t xml:space="preserve"> </w:t>
-      </w:r>
-      <w:r>
-        <w:rPr>
-          <w:rFonts w:asciiTheme="minorHAnsi" w:hAnsiTheme="minorHAnsi" w:cstheme="minorHAnsi"/>
-        </w:rPr>
-        <w:t>Aplikacija je namenjena zaposlenima u prodaji i logistici, sa ciljem da omogući jednostavno i efikasno upravljanje procesom prodaje transportnih usluga. Kroz aplikaciju korisnici imaju mogućnost da unose i obrađuju zahteve za transport, kreiraju ponude, evidentiraju rezervacije i prate realizaciju transportnih tura.</w:t>
+        <w:t>Predložena aplikacija namenjena je podršci procesu prodaje transportnih usluga u okviru sistema MPM Transport. Aplikacija je namenjena zaposlenima u prodaji i logistici, sa ciljem da omogući jednostavno i efikasno upravljanje procesom prodaje transportnih usluga. Kroz aplikaciju korisnici imaju mogućnost da unose i obrađuju zahteve za transport, kreiraju ponude, evidentiraju rezervacije i prate realizaciju transportnih tura.</w:t>
       </w:r>
       <w:r>
         <w:rPr>
@@ -4818,7 +4727,7 @@
                     </pic:cNvPicPr>
                   </pic:nvPicPr>
                   <pic:blipFill>
-                    <a:blip r:embed="rId19" cstate="print">
+                    <a:blip r:embed="rId20" cstate="print">
                       <a:extLst>
                         <a:ext uri="{28A0092B-C50C-407E-A947-70E740481C1C}">
                           <a14:useLocalDpi xmlns:a14="http://schemas.microsoft.com/office/drawing/2010/main" val="0"/>
@@ -4893,7 +4802,7 @@
                     </pic:cNvPicPr>
                   </pic:nvPicPr>
                   <pic:blipFill>
-                    <a:blip r:embed="rId20" cstate="print">
+                    <a:blip r:embed="rId21" cstate="print">
                       <a:extLst>
                         <a:ext uri="{28A0092B-C50C-407E-A947-70E740481C1C}">
                           <a14:useLocalDpi xmlns:a14="http://schemas.microsoft.com/office/drawing/2010/main" val="0"/>
@@ -4968,7 +4877,7 @@
                     </pic:cNvPicPr>
                   </pic:nvPicPr>
                   <pic:blipFill>
-                    <a:blip r:embed="rId21" cstate="print">
+                    <a:blip r:embed="rId22" cstate="print">
                       <a:extLst>
                         <a:ext uri="{28A0092B-C50C-407E-A947-70E740481C1C}">
                           <a14:useLocalDpi xmlns:a14="http://schemas.microsoft.com/office/drawing/2010/main" val="0"/>
@@ -5035,7 +4944,7 @@
                     </pic:cNvPicPr>
                   </pic:nvPicPr>
                   <pic:blipFill>
-                    <a:blip r:embed="rId22" cstate="print">
+                    <a:blip r:embed="rId23" cstate="print">
                       <a:extLst>
                         <a:ext uri="{28A0092B-C50C-407E-A947-70E740481C1C}">
                           <a14:useLocalDpi xmlns:a14="http://schemas.microsoft.com/office/drawing/2010/main" val="0"/>
@@ -5209,10 +5118,7 @@
                               <w:jc w:val="center"/>
                             </w:pPr>
                             <w:r>
-                              <w:t>Slik</w:t>
-                            </w:r>
-                            <w:r>
-                              <w:t>a 15.</w:t>
+                              <w:t>Slika 15.</w:t>
                             </w:r>
                           </w:p>
                         </w:txbxContent>
@@ -5242,10 +5148,7 @@
                         <w:jc w:val="center"/>
                       </w:pPr>
                       <w:r>
-                        <w:t>Slik</w:t>
-                      </w:r>
-                      <w:r>
-                        <w:t>a 15.</w:t>
+                        <w:t>Slika 15.</w:t>
                       </w:r>
                     </w:p>
                   </w:txbxContent>
@@ -5313,13 +5216,7 @@
                               <w:jc w:val="center"/>
                             </w:pPr>
                             <w:r>
-                              <w:t>Slika 1</w:t>
-                            </w:r>
-                            <w:r>
-                              <w:t>4</w:t>
-                            </w:r>
-                            <w:r>
-                              <w:t xml:space="preserve">. </w:t>
+                              <w:t xml:space="preserve">Slika 14. </w:t>
                             </w:r>
                           </w:p>
                         </w:txbxContent>
@@ -5349,13 +5246,7 @@
                         <w:jc w:val="center"/>
                       </w:pPr>
                       <w:r>
-                        <w:t>Slika 1</w:t>
-                      </w:r>
-                      <w:r>
-                        <w:t>4</w:t>
-                      </w:r>
-                      <w:r>
-                        <w:t xml:space="preserve">. </w:t>
+                        <w:t xml:space="preserve">Slika 14. </w:t>
                       </w:r>
                     </w:p>
                   </w:txbxContent>
@@ -5431,16 +5322,7 @@
                               <w:jc w:val="center"/>
                             </w:pPr>
                             <w:r>
-                              <w:t>Slika 1</w:t>
-                            </w:r>
-                            <w:r>
-                              <w:t>3</w:t>
-                            </w:r>
-                            <w:r>
-                              <w:t xml:space="preserve">. </w:t>
-                            </w:r>
-                            <w:r>
-                              <w:t>Ekran za prijavu</w:t>
+                              <w:t>Slika 13. Ekran za prijavu</w:t>
                             </w:r>
                           </w:p>
                         </w:txbxContent>
@@ -5470,16 +5352,7 @@
                         <w:jc w:val="center"/>
                       </w:pPr>
                       <w:r>
-                        <w:t>Slika 1</w:t>
-                      </w:r>
-                      <w:r>
-                        <w:t>3</w:t>
-                      </w:r>
-                      <w:r>
-                        <w:t xml:space="preserve">. </w:t>
-                      </w:r>
-                      <w:r>
-                        <w:t>Ekran za prijavu</w:t>
+                        <w:t>Slika 13. Ekran za prijavu</w:t>
                       </w:r>
                     </w:p>
                   </w:txbxContent>
@@ -5547,16 +5420,7 @@
                               <w:jc w:val="center"/>
                             </w:pPr>
                             <w:r>
-                              <w:t>Slika 1</w:t>
-                            </w:r>
-                            <w:r>
-                              <w:t>2</w:t>
-                            </w:r>
-                            <w:r>
-                              <w:t>.</w:t>
-                            </w:r>
-                            <w:r>
-                              <w:t xml:space="preserve"> Početni ekran</w:t>
+                              <w:t>Slika 12. Početni ekran</w:t>
                             </w:r>
                           </w:p>
                         </w:txbxContent>
@@ -5586,16 +5450,7 @@
                         <w:jc w:val="center"/>
                       </w:pPr>
                       <w:r>
-                        <w:t>Slika 1</w:t>
-                      </w:r>
-                      <w:r>
-                        <w:t>2</w:t>
-                      </w:r>
-                      <w:r>
-                        <w:t>.</w:t>
-                      </w:r>
-                      <w:r>
-                        <w:t xml:space="preserve"> Početni ekran</w:t>
+                        <w:t>Slika 12. Početni ekran</w:t>
                       </w:r>
                     </w:p>
                   </w:txbxContent>
@@ -5800,16 +5655,7 @@
                               <w:jc w:val="center"/>
                             </w:pPr>
                             <w:r>
-                              <w:t>Slika 1</w:t>
-                            </w:r>
-                            <w:r>
-                              <w:t>6</w:t>
-                            </w:r>
-                            <w:r>
-                              <w:t>.</w:t>
-                            </w:r>
-                            <w:r>
-                              <w:t xml:space="preserve"> Administrator</w:t>
+                              <w:t>Slika 16. Administrator</w:t>
                             </w:r>
                           </w:p>
                         </w:txbxContent>
@@ -5839,16 +5685,7 @@
                         <w:jc w:val="center"/>
                       </w:pPr>
                       <w:r>
-                        <w:t>Slika 1</w:t>
-                      </w:r>
-                      <w:r>
-                        <w:t>6</w:t>
-                      </w:r>
-                      <w:r>
-                        <w:t>.</w:t>
-                      </w:r>
-                      <w:r>
-                        <w:t xml:space="preserve"> Administrator</w:t>
+                        <w:t>Slika 16. Administrator</w:t>
                       </w:r>
                     </w:p>
                   </w:txbxContent>
@@ -5916,16 +5753,7 @@
                               <w:jc w:val="center"/>
                             </w:pPr>
                             <w:r>
-                              <w:t>Slika 1</w:t>
-                            </w:r>
-                            <w:r>
-                              <w:t>7</w:t>
-                            </w:r>
-                            <w:r>
-                              <w:t>.</w:t>
-                            </w:r>
-                            <w:r>
-                              <w:t xml:space="preserve"> Menadžer</w:t>
+                              <w:t>Slika 17. Menadžer</w:t>
                             </w:r>
                           </w:p>
                         </w:txbxContent>
@@ -5955,16 +5783,7 @@
                         <w:jc w:val="center"/>
                       </w:pPr>
                       <w:r>
-                        <w:t>Slika 1</w:t>
-                      </w:r>
-                      <w:r>
-                        <w:t>7</w:t>
-                      </w:r>
-                      <w:r>
-                        <w:t>.</w:t>
-                      </w:r>
-                      <w:r>
-                        <w:t xml:space="preserve"> Menadžer</w:t>
+                        <w:t>Slika 17. Menadžer</w:t>
                       </w:r>
                     </w:p>
                   </w:txbxContent>
@@ -6032,16 +5851,7 @@
                               <w:jc w:val="center"/>
                             </w:pPr>
                             <w:r>
-                              <w:t xml:space="preserve">Slika </w:t>
-                            </w:r>
-                            <w:r>
-                              <w:t>20</w:t>
-                            </w:r>
-                            <w:r>
-                              <w:t>.</w:t>
-                            </w:r>
-                            <w:r>
-                              <w:t xml:space="preserve"> Vozač</w:t>
+                              <w:t>Slika 20. Vozač</w:t>
                             </w:r>
                           </w:p>
                         </w:txbxContent>
@@ -6071,16 +5881,7 @@
                         <w:jc w:val="center"/>
                       </w:pPr>
                       <w:r>
-                        <w:t xml:space="preserve">Slika </w:t>
-                      </w:r>
-                      <w:r>
-                        <w:t>20</w:t>
-                      </w:r>
-                      <w:r>
-                        <w:t>.</w:t>
-                      </w:r>
-                      <w:r>
-                        <w:t xml:space="preserve"> Vozač</w:t>
+                        <w:t>Slika 20. Vozač</w:t>
                       </w:r>
                     </w:p>
                   </w:txbxContent>
@@ -6148,16 +5949,7 @@
                               <w:jc w:val="center"/>
                             </w:pPr>
                             <w:r>
-                              <w:t>Slika 1</w:t>
-                            </w:r>
-                            <w:r>
-                              <w:t>9</w:t>
-                            </w:r>
-                            <w:r>
-                              <w:t>.</w:t>
-                            </w:r>
-                            <w:r>
-                              <w:t xml:space="preserve"> Dispečer</w:t>
+                              <w:t>Slika 19. Dispečer</w:t>
                             </w:r>
                           </w:p>
                         </w:txbxContent>
@@ -6187,16 +5979,7 @@
                         <w:jc w:val="center"/>
                       </w:pPr>
                       <w:r>
-                        <w:t>Slika 1</w:t>
-                      </w:r>
-                      <w:r>
-                        <w:t>9</w:t>
-                      </w:r>
-                      <w:r>
-                        <w:t>.</w:t>
-                      </w:r>
-                      <w:r>
-                        <w:t xml:space="preserve"> Dispečer</w:t>
+                        <w:t>Slika 19. Dispečer</w:t>
                       </w:r>
                     </w:p>
                   </w:txbxContent>
@@ -6264,16 +6047,7 @@
                               <w:jc w:val="center"/>
                             </w:pPr>
                             <w:r>
-                              <w:t>Slika 1</w:t>
-                            </w:r>
-                            <w:r>
-                              <w:t>8</w:t>
-                            </w:r>
-                            <w:r>
-                              <w:t>.</w:t>
-                            </w:r>
-                            <w:r>
-                              <w:t xml:space="preserve"> Klijent</w:t>
+                              <w:t>Slika 18. Klijent</w:t>
                             </w:r>
                           </w:p>
                         </w:txbxContent>
@@ -6303,16 +6077,7 @@
                         <w:jc w:val="center"/>
                       </w:pPr>
                       <w:r>
-                        <w:t>Slika 1</w:t>
-                      </w:r>
-                      <w:r>
-                        <w:t>8</w:t>
-                      </w:r>
-                      <w:r>
-                        <w:t>.</w:t>
-                      </w:r>
-                      <w:r>
-                        <w:t xml:space="preserve"> Klijent</w:t>
+                        <w:t>Slika 18. Klijent</w:t>
                       </w:r>
                     </w:p>
                   </w:txbxContent>
@@ -6361,7 +6126,7 @@
                     </pic:cNvPicPr>
                   </pic:nvPicPr>
                   <pic:blipFill>
-                    <a:blip r:embed="rId23" cstate="print">
+                    <a:blip r:embed="rId24" cstate="print">
                       <a:extLst>
                         <a:ext uri="{28A0092B-C50C-407E-A947-70E740481C1C}">
                           <a14:useLocalDpi xmlns:a14="http://schemas.microsoft.com/office/drawing/2010/main" val="0"/>
@@ -6425,75 +6190,6 @@
                 <pic:pic xmlns:pic="http://schemas.openxmlformats.org/drawingml/2006/picture">
                   <pic:nvPicPr>
                     <pic:cNvPr id="0" name="Picture 16"/>
-                    <pic:cNvPicPr>
-                      <a:picLocks noChangeAspect="1" noChangeArrowheads="1"/>
-                    </pic:cNvPicPr>
-                  </pic:nvPicPr>
-                  <pic:blipFill>
-                    <a:blip r:embed="rId24" cstate="print">
-                      <a:extLst>
-                        <a:ext uri="{28A0092B-C50C-407E-A947-70E740481C1C}">
-                          <a14:useLocalDpi xmlns:a14="http://schemas.microsoft.com/office/drawing/2010/main" val="0"/>
-                        </a:ext>
-                      </a:extLst>
-                    </a:blip>
-                    <a:srcRect/>
-                    <a:stretch>
-                      <a:fillRect/>
-                    </a:stretch>
-                  </pic:blipFill>
-                  <pic:spPr bwMode="auto">
-                    <a:xfrm>
-                      <a:off x="0" y="0"/>
-                      <a:ext cx="1310005" cy="2834640"/>
-                    </a:xfrm>
-                    <a:prstGeom prst="rect">
-                      <a:avLst/>
-                    </a:prstGeom>
-                    <a:noFill/>
-                    <a:ln>
-                      <a:noFill/>
-                    </a:ln>
-                  </pic:spPr>
-                </pic:pic>
-              </a:graphicData>
-            </a:graphic>
-          </wp:anchor>
-        </w:drawing>
-      </w:r>
-      <w:r>
-        <w:rPr>
-          <w:noProof/>
-        </w:rPr>
-        <w:drawing>
-          <wp:anchor distT="0" distB="0" distL="114300" distR="114300" simplePos="0" relativeHeight="251711488" behindDoc="1" locked="0" layoutInCell="1" allowOverlap="1" wp14:anchorId="218BF0D2" wp14:editId="7A06AB0B">
-            <wp:simplePos x="0" y="0"/>
-            <wp:positionH relativeFrom="margin">
-              <wp:posOffset>2153708</wp:posOffset>
-            </wp:positionH>
-            <wp:positionV relativeFrom="page">
-              <wp:posOffset>2283460</wp:posOffset>
-            </wp:positionV>
-            <wp:extent cx="1310005" cy="2834640"/>
-            <wp:effectExtent l="0" t="0" r="4445" b="3810"/>
-            <wp:wrapTight wrapText="bothSides">
-              <wp:wrapPolygon edited="0">
-                <wp:start x="0" y="0"/>
-                <wp:lineTo x="0" y="21484"/>
-                <wp:lineTo x="21359" y="21484"/>
-                <wp:lineTo x="21359" y="0"/>
-                <wp:lineTo x="0" y="0"/>
-              </wp:wrapPolygon>
-            </wp:wrapTight>
-            <wp:docPr id="35" name="Picture 35"/>
-            <wp:cNvGraphicFramePr>
-              <a:graphicFrameLocks xmlns:a="http://schemas.openxmlformats.org/drawingml/2006/main" noChangeAspect="1"/>
-            </wp:cNvGraphicFramePr>
-            <a:graphic xmlns:a="http://schemas.openxmlformats.org/drawingml/2006/main">
-              <a:graphicData uri="http://schemas.openxmlformats.org/drawingml/2006/picture">
-                <pic:pic xmlns:pic="http://schemas.openxmlformats.org/drawingml/2006/picture">
-                  <pic:nvPicPr>
-                    <pic:cNvPr id="0" name="Picture 18"/>
                     <pic:cNvPicPr>
                       <a:picLocks noChangeAspect="1" noChangeArrowheads="1"/>
                     </pic:cNvPicPr>
@@ -6535,13 +6231,13 @@
           <w:noProof/>
         </w:rPr>
         <w:drawing>
-          <wp:anchor distT="0" distB="0" distL="114300" distR="114300" simplePos="0" relativeHeight="251712512" behindDoc="1" locked="0" layoutInCell="1" allowOverlap="1" wp14:anchorId="097816DE" wp14:editId="22EB9334">
+          <wp:anchor distT="0" distB="0" distL="114300" distR="114300" simplePos="0" relativeHeight="251711488" behindDoc="1" locked="0" layoutInCell="1" allowOverlap="1" wp14:anchorId="218BF0D2" wp14:editId="7A06AB0B">
             <wp:simplePos x="0" y="0"/>
-            <wp:positionH relativeFrom="column">
-              <wp:posOffset>668231</wp:posOffset>
+            <wp:positionH relativeFrom="margin">
+              <wp:posOffset>2153708</wp:posOffset>
             </wp:positionH>
             <wp:positionV relativeFrom="page">
-              <wp:posOffset>2287905</wp:posOffset>
+              <wp:posOffset>2283460</wp:posOffset>
             </wp:positionV>
             <wp:extent cx="1310005" cy="2834640"/>
             <wp:effectExtent l="0" t="0" r="4445" b="3810"/>
@@ -6554,7 +6250,7 @@
                 <wp:lineTo x="0" y="0"/>
               </wp:wrapPolygon>
             </wp:wrapTight>
-            <wp:docPr id="32" name="Picture 32"/>
+            <wp:docPr id="35" name="Picture 35"/>
             <wp:cNvGraphicFramePr>
               <a:graphicFrameLocks xmlns:a="http://schemas.openxmlformats.org/drawingml/2006/main" noChangeAspect="1"/>
             </wp:cNvGraphicFramePr>
@@ -6562,7 +6258,7 @@
               <a:graphicData uri="http://schemas.openxmlformats.org/drawingml/2006/picture">
                 <pic:pic xmlns:pic="http://schemas.openxmlformats.org/drawingml/2006/picture">
                   <pic:nvPicPr>
-                    <pic:cNvPr id="0" name="Picture 12"/>
+                    <pic:cNvPr id="0" name="Picture 18"/>
                     <pic:cNvPicPr>
                       <a:picLocks noChangeAspect="1" noChangeArrowheads="1"/>
                     </pic:cNvPicPr>
@@ -6604,13 +6300,13 @@
           <w:noProof/>
         </w:rPr>
         <w:drawing>
-          <wp:anchor distT="0" distB="0" distL="114300" distR="114300" simplePos="0" relativeHeight="251709440" behindDoc="1" locked="0" layoutInCell="1" allowOverlap="1" wp14:anchorId="0714CA8B" wp14:editId="3D44A049">
+          <wp:anchor distT="0" distB="0" distL="114300" distR="114300" simplePos="0" relativeHeight="251712512" behindDoc="1" locked="0" layoutInCell="1" allowOverlap="1" wp14:anchorId="097816DE" wp14:editId="22EB9334">
             <wp:simplePos x="0" y="0"/>
             <wp:positionH relativeFrom="column">
-              <wp:posOffset>-803275</wp:posOffset>
+              <wp:posOffset>668231</wp:posOffset>
             </wp:positionH>
             <wp:positionV relativeFrom="page">
-              <wp:posOffset>2287058</wp:posOffset>
+              <wp:posOffset>2287905</wp:posOffset>
             </wp:positionV>
             <wp:extent cx="1310005" cy="2834640"/>
             <wp:effectExtent l="0" t="0" r="4445" b="3810"/>
@@ -6623,7 +6319,7 @@
                 <wp:lineTo x="0" y="0"/>
               </wp:wrapPolygon>
             </wp:wrapTight>
-            <wp:docPr id="33" name="Picture 33"/>
+            <wp:docPr id="32" name="Picture 32"/>
             <wp:cNvGraphicFramePr>
               <a:graphicFrameLocks xmlns:a="http://schemas.openxmlformats.org/drawingml/2006/main" noChangeAspect="1"/>
             </wp:cNvGraphicFramePr>
@@ -6631,7 +6327,7 @@
               <a:graphicData uri="http://schemas.openxmlformats.org/drawingml/2006/picture">
                 <pic:pic xmlns:pic="http://schemas.openxmlformats.org/drawingml/2006/picture">
                   <pic:nvPicPr>
-                    <pic:cNvPr id="0" name="Picture 14"/>
+                    <pic:cNvPr id="0" name="Picture 12"/>
                     <pic:cNvPicPr>
                       <a:picLocks noChangeAspect="1" noChangeArrowheads="1"/>
                     </pic:cNvPicPr>
@@ -6668,6 +6364,75 @@
           </wp:anchor>
         </w:drawing>
       </w:r>
+      <w:r>
+        <w:rPr>
+          <w:noProof/>
+        </w:rPr>
+        <w:drawing>
+          <wp:anchor distT="0" distB="0" distL="114300" distR="114300" simplePos="0" relativeHeight="251709440" behindDoc="1" locked="0" layoutInCell="1" allowOverlap="1" wp14:anchorId="0714CA8B" wp14:editId="3D44A049">
+            <wp:simplePos x="0" y="0"/>
+            <wp:positionH relativeFrom="column">
+              <wp:posOffset>-803275</wp:posOffset>
+            </wp:positionH>
+            <wp:positionV relativeFrom="page">
+              <wp:posOffset>2287058</wp:posOffset>
+            </wp:positionV>
+            <wp:extent cx="1310005" cy="2834640"/>
+            <wp:effectExtent l="0" t="0" r="4445" b="3810"/>
+            <wp:wrapTight wrapText="bothSides">
+              <wp:wrapPolygon edited="0">
+                <wp:start x="0" y="0"/>
+                <wp:lineTo x="0" y="21484"/>
+                <wp:lineTo x="21359" y="21484"/>
+                <wp:lineTo x="21359" y="0"/>
+                <wp:lineTo x="0" y="0"/>
+              </wp:wrapPolygon>
+            </wp:wrapTight>
+            <wp:docPr id="33" name="Picture 33"/>
+            <wp:cNvGraphicFramePr>
+              <a:graphicFrameLocks xmlns:a="http://schemas.openxmlformats.org/drawingml/2006/main" noChangeAspect="1"/>
+            </wp:cNvGraphicFramePr>
+            <a:graphic xmlns:a="http://schemas.openxmlformats.org/drawingml/2006/main">
+              <a:graphicData uri="http://schemas.openxmlformats.org/drawingml/2006/picture">
+                <pic:pic xmlns:pic="http://schemas.openxmlformats.org/drawingml/2006/picture">
+                  <pic:nvPicPr>
+                    <pic:cNvPr id="0" name="Picture 14"/>
+                    <pic:cNvPicPr>
+                      <a:picLocks noChangeAspect="1" noChangeArrowheads="1"/>
+                    </pic:cNvPicPr>
+                  </pic:nvPicPr>
+                  <pic:blipFill>
+                    <a:blip r:embed="rId28" cstate="print">
+                      <a:extLst>
+                        <a:ext uri="{28A0092B-C50C-407E-A947-70E740481C1C}">
+                          <a14:useLocalDpi xmlns:a14="http://schemas.microsoft.com/office/drawing/2010/main" val="0"/>
+                        </a:ext>
+                      </a:extLst>
+                    </a:blip>
+                    <a:srcRect/>
+                    <a:stretch>
+                      <a:fillRect/>
+                    </a:stretch>
+                  </pic:blipFill>
+                  <pic:spPr bwMode="auto">
+                    <a:xfrm>
+                      <a:off x="0" y="0"/>
+                      <a:ext cx="1310005" cy="2834640"/>
+                    </a:xfrm>
+                    <a:prstGeom prst="rect">
+                      <a:avLst/>
+                    </a:prstGeom>
+                    <a:noFill/>
+                    <a:ln>
+                      <a:noFill/>
+                    </a:ln>
+                  </pic:spPr>
+                </pic:pic>
+              </a:graphicData>
+            </a:graphic>
+          </wp:anchor>
+        </w:drawing>
+      </w:r>
     </w:p>
     <w:p>
       <w:pPr>
@@ -6870,7 +6635,15 @@
           <w:sz w:val="34"/>
           <w:szCs w:val="34"/>
         </w:rPr>
-        <w:t>4.3 Dispečer interfejs</w:t>
+        <w:t xml:space="preserve">4.3 </w:t>
+      </w:r>
+      <w:r>
+        <w:rPr>
+          <w:rFonts w:eastAsia="Times New Roman" w:cstheme="minorHAnsi"/>
+          <w:sz w:val="34"/>
+          <w:szCs w:val="34"/>
+        </w:rPr>
+        <w:t>Kreiranje I upravljanje zahtevima</w:t>
       </w:r>
     </w:p>
     <w:p>
@@ -6926,7 +6699,7 @@
                     </pic:cNvPicPr>
                   </pic:nvPicPr>
                   <pic:blipFill>
-                    <a:blip r:embed="rId28" cstate="print">
+                    <a:blip r:embed="rId29" cstate="print">
                       <a:extLst>
                         <a:ext uri="{28A0092B-C50C-407E-A947-70E740481C1C}">
                           <a14:useLocalDpi xmlns:a14="http://schemas.microsoft.com/office/drawing/2010/main" val="0"/>
@@ -7004,7 +6777,7 @@
                     </pic:cNvPicPr>
                   </pic:nvPicPr>
                   <pic:blipFill>
-                    <a:blip r:embed="rId29" cstate="print">
+                    <a:blip r:embed="rId30" cstate="print">
                       <a:extLst>
                         <a:ext uri="{28A0092B-C50C-407E-A947-70E740481C1C}">
                           <a14:useLocalDpi xmlns:a14="http://schemas.microsoft.com/office/drawing/2010/main" val="0"/>
@@ -7082,7 +6855,7 @@
                     </pic:cNvPicPr>
                   </pic:nvPicPr>
                   <pic:blipFill>
-                    <a:blip r:embed="rId29" cstate="print">
+                    <a:blip r:embed="rId30" cstate="print">
                       <a:extLst>
                         <a:ext uri="{28A0092B-C50C-407E-A947-70E740481C1C}">
                           <a14:useLocalDpi xmlns:a14="http://schemas.microsoft.com/office/drawing/2010/main" val="0"/>
@@ -7160,7 +6933,7 @@
                     </pic:cNvPicPr>
                   </pic:nvPicPr>
                   <pic:blipFill>
-                    <a:blip r:embed="rId30" cstate="print">
+                    <a:blip r:embed="rId31" cstate="print">
                       <a:extLst>
                         <a:ext uri="{28A0092B-C50C-407E-A947-70E740481C1C}">
                           <a14:useLocalDpi xmlns:a14="http://schemas.microsoft.com/office/drawing/2010/main" val="0"/>
@@ -7335,7 +7108,7 @@
                     </pic:cNvPicPr>
                   </pic:nvPicPr>
                   <pic:blipFill>
-                    <a:blip r:embed="rId31" cstate="print">
+                    <a:blip r:embed="rId32" cstate="print">
                       <a:extLst>
                         <a:ext uri="{28A0092B-C50C-407E-A947-70E740481C1C}">
                           <a14:useLocalDpi xmlns:a14="http://schemas.microsoft.com/office/drawing/2010/main" val="0"/>
@@ -7393,10 +7166,108 @@
         <mc:AlternateContent>
           <mc:Choice Requires="wps">
             <w:drawing>
-              <wp:anchor distT="45720" distB="45720" distL="114300" distR="114300" simplePos="0" relativeHeight="251739136" behindDoc="0" locked="0" layoutInCell="1" allowOverlap="1" wp14:anchorId="5514413A" wp14:editId="43A1D64F">
+              <wp:anchor distT="45720" distB="45720" distL="114300" distR="114300" simplePos="0" relativeHeight="251741184" behindDoc="0" locked="0" layoutInCell="1" allowOverlap="1" wp14:anchorId="581C9DEB" wp14:editId="7FC27C4F">
                 <wp:simplePos x="0" y="0"/>
                 <wp:positionH relativeFrom="page">
-                  <wp:posOffset>4189095</wp:posOffset>
+                  <wp:posOffset>6004560</wp:posOffset>
+                </wp:positionH>
+                <wp:positionV relativeFrom="page">
+                  <wp:align>bottom</wp:align>
+                </wp:positionV>
+                <wp:extent cx="1219200" cy="295910"/>
+                <wp:effectExtent l="0" t="0" r="19050" b="27940"/>
+                <wp:wrapSquare wrapText="bothSides"/>
+                <wp:docPr id="51" name="Text Box 2"/>
+                <wp:cNvGraphicFramePr>
+                  <a:graphicFrameLocks xmlns:a="http://schemas.openxmlformats.org/drawingml/2006/main"/>
+                </wp:cNvGraphicFramePr>
+                <a:graphic xmlns:a="http://schemas.openxmlformats.org/drawingml/2006/main">
+                  <a:graphicData uri="http://schemas.microsoft.com/office/word/2010/wordprocessingShape">
+                    <wps:wsp>
+                      <wps:cNvSpPr txBox="1">
+                        <a:spLocks noChangeArrowheads="1"/>
+                      </wps:cNvSpPr>
+                      <wps:spPr bwMode="auto">
+                        <a:xfrm>
+                          <a:off x="0" y="0"/>
+                          <a:ext cx="1219200" cy="295910"/>
+                        </a:xfrm>
+                        <a:prstGeom prst="rect">
+                          <a:avLst/>
+                        </a:prstGeom>
+                        <a:solidFill>
+                          <a:srgbClr val="FFFFFF"/>
+                        </a:solidFill>
+                        <a:ln w="9525">
+                          <a:solidFill>
+                            <a:schemeClr val="bg1"/>
+                          </a:solidFill>
+                          <a:miter lim="800000"/>
+                          <a:headEnd/>
+                          <a:tailEnd/>
+                        </a:ln>
+                      </wps:spPr>
+                      <wps:txbx>
+                        <w:txbxContent>
+                          <w:p>
+                            <w:pPr>
+                              <w:jc w:val="center"/>
+                            </w:pPr>
+                            <w:r>
+                              <w:t>Slika 24.</w:t>
+                            </w:r>
+                          </w:p>
+                        </w:txbxContent>
+                      </wps:txbx>
+                      <wps:bodyPr rot="0" vert="horz" wrap="square" lIns="91440" tIns="45720" rIns="91440" bIns="45720" anchor="t" anchorCtr="0">
+                        <a:noAutofit/>
+                      </wps:bodyPr>
+                    </wps:wsp>
+                  </a:graphicData>
+                </a:graphic>
+                <wp14:sizeRelH relativeFrom="margin">
+                  <wp14:pctWidth>0</wp14:pctWidth>
+                </wp14:sizeRelH>
+                <wp14:sizeRelV relativeFrom="margin">
+                  <wp14:pctHeight>0</wp14:pctHeight>
+                </wp14:sizeRelV>
+              </wp:anchor>
+            </w:drawing>
+          </mc:Choice>
+          <mc:Fallback>
+            <w:pict>
+              <v:shape w14:anchorId="581C9DEB" id="_x0000_s1046" type="#_x0000_t202" style="position:absolute;left:0;text-align:left;margin-left:472.8pt;margin-top:0;width:96pt;height:23.3pt;z-index:251741184;visibility:visible;mso-wrap-style:square;mso-width-percent:0;mso-height-percent:0;mso-wrap-distance-left:9pt;mso-wrap-distance-top:3.6pt;mso-wrap-distance-right:9pt;mso-wrap-distance-bottom:3.6pt;mso-position-horizontal:absolute;mso-position-horizontal-relative:page;mso-position-vertical:bottom;mso-position-vertical-relative:page;mso-width-percent:0;mso-height-percent:0;mso-width-relative:margin;mso-height-relative:margin;v-text-anchor:top" o:gfxdata="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" strokecolor="white [3212]">
+                <v:textbox>
+                  <w:txbxContent>
+                    <w:p>
+                      <w:pPr>
+                        <w:jc w:val="center"/>
+                      </w:pPr>
+                      <w:r>
+                        <w:t>Slika 24.</w:t>
+                      </w:r>
+                    </w:p>
+                  </w:txbxContent>
+                </v:textbox>
+                <w10:wrap type="square" anchorx="page" anchory="page"/>
+              </v:shape>
+            </w:pict>
+          </mc:Fallback>
+        </mc:AlternateContent>
+      </w:r>
+      <w:r>
+        <w:rPr>
+          <w:noProof/>
+          <w:sz w:val="36"/>
+          <w:szCs w:val="36"/>
+        </w:rPr>
+        <mc:AlternateContent>
+          <mc:Choice Requires="wps">
+            <w:drawing>
+              <wp:anchor distT="45720" distB="45720" distL="114300" distR="114300" simplePos="0" relativeHeight="251739136" behindDoc="0" locked="0" layoutInCell="1" allowOverlap="1" wp14:anchorId="5514413A" wp14:editId="737DC99C">
+                <wp:simplePos x="0" y="0"/>
+                <wp:positionH relativeFrom="page">
+                  <wp:posOffset>4150995</wp:posOffset>
                 </wp:positionH>
                 <wp:positionV relativeFrom="page">
                   <wp:align>bottom</wp:align>
@@ -7441,10 +7312,7 @@
                               <w:jc w:val="center"/>
                             </w:pPr>
                             <w:r>
-                              <w:t>Slika 2</w:t>
-                            </w:r>
-                            <w:r>
-                              <w:t>3.</w:t>
+                              <w:t>Slika 23.</w:t>
                             </w:r>
                           </w:p>
                         </w:txbxContent>
@@ -7466,7 +7334,7 @@
           </mc:Choice>
           <mc:Fallback>
             <w:pict>
-              <v:shape w14:anchorId="5514413A" id="_x0000_s1046" type="#_x0000_t202" style="position:absolute;left:0;text-align:left;margin-left:329.85pt;margin-top:0;width:96pt;height:20.8pt;z-index:251739136;visibility:visible;mso-wrap-style:square;mso-width-percent:0;mso-height-percent:0;mso-wrap-distance-left:9pt;mso-wrap-distance-top:3.6pt;mso-wrap-distance-right:9pt;mso-wrap-distance-bottom:3.6pt;mso-position-horizontal:absolute;mso-position-horizontal-relative:page;mso-position-vertical:bottom;mso-position-vertical-relative:page;mso-width-percent:0;mso-height-percent:0;mso-width-relative:margin;mso-height-relative:margin;v-text-anchor:top" o:gfxdata="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" strokecolor="white [3212]">
+              <v:shape w14:anchorId="5514413A" id="_x0000_s1047" type="#_x0000_t202" style="position:absolute;left:0;text-align:left;margin-left:326.85pt;margin-top:0;width:96pt;height:20.8pt;z-index:251739136;visibility:visible;mso-wrap-style:square;mso-width-percent:0;mso-height-percent:0;mso-wrap-distance-left:9pt;mso-wrap-distance-top:3.6pt;mso-wrap-distance-right:9pt;mso-wrap-distance-bottom:3.6pt;mso-position-horizontal:absolute;mso-position-horizontal-relative:page;mso-position-vertical:bottom;mso-position-vertical-relative:page;mso-width-percent:0;mso-height-percent:0;mso-width-relative:margin;mso-height-relative:margin;v-text-anchor:top" o:gfxdata="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" strokecolor="white [3212]">
                 <v:textbox>
                   <w:txbxContent>
                     <w:p>
@@ -7474,10 +7342,7 @@
                         <w:jc w:val="center"/>
                       </w:pPr>
                       <w:r>
-                        <w:t>Slika 2</w:t>
-                      </w:r>
-                      <w:r>
-                        <w:t>3.</w:t>
+                        <w:t>Slika 23.</w:t>
                       </w:r>
                     </w:p>
                   </w:txbxContent>
@@ -7497,13 +7362,13 @@
         <mc:AlternateContent>
           <mc:Choice Requires="wps">
             <w:drawing>
-              <wp:anchor distT="45720" distB="45720" distL="114300" distR="114300" simplePos="0" relativeHeight="251731968" behindDoc="0" locked="0" layoutInCell="1" allowOverlap="1" wp14:anchorId="7AF7CCBF" wp14:editId="29C83D27">
+              <wp:anchor distT="45720" distB="45720" distL="114300" distR="114300" simplePos="0" relativeHeight="251731968" behindDoc="0" locked="0" layoutInCell="1" allowOverlap="1" wp14:anchorId="7AF7CCBF" wp14:editId="74F9F5AB">
                 <wp:simplePos x="0" y="0"/>
                 <wp:positionH relativeFrom="page">
-                  <wp:posOffset>1911350</wp:posOffset>
+                  <wp:posOffset>2082800</wp:posOffset>
                 </wp:positionH>
                 <wp:positionV relativeFrom="page">
-                  <wp:posOffset>9734550</wp:posOffset>
+                  <wp:posOffset>9740900</wp:posOffset>
                 </wp:positionV>
                 <wp:extent cx="1758950" cy="295910"/>
                 <wp:effectExtent l="0" t="0" r="12700" b="27940"/>
@@ -7545,16 +7410,7 @@
                               <w:jc w:val="center"/>
                             </w:pPr>
                             <w:r>
-                              <w:t>Slika 2</w:t>
-                            </w:r>
-                            <w:r>
-                              <w:t>2</w:t>
-                            </w:r>
-                            <w:r>
-                              <w:t xml:space="preserve">. </w:t>
-                            </w:r>
-                            <w:r>
-                              <w:t>Prodaja tura</w:t>
+                              <w:t>Slika 22. Prodaja tura</w:t>
                             </w:r>
                           </w:p>
                         </w:txbxContent>
@@ -7576,7 +7432,7 @@
           </mc:Choice>
           <mc:Fallback>
             <w:pict>
-              <v:shape w14:anchorId="7AF7CCBF" id="_x0000_s1047" type="#_x0000_t202" style="position:absolute;left:0;text-align:left;margin-left:150.5pt;margin-top:766.5pt;width:138.5pt;height:23.3pt;z-index:251731968;visibility:visible;mso-wrap-style:square;mso-width-percent:0;mso-height-percent:0;mso-wrap-distance-left:9pt;mso-wrap-distance-top:3.6pt;mso-wrap-distance-right:9pt;mso-wrap-distance-bottom:3.6pt;mso-position-horizontal:absolute;mso-position-horizontal-relative:page;mso-position-vertical:absolute;mso-position-vertical-relative:page;mso-width-percent:0;mso-height-percent:0;mso-width-relative:margin;mso-height-relative:margin;v-text-anchor:top" o:gfxdata="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" strokecolor="white [3212]">
+              <v:shape w14:anchorId="7AF7CCBF" id="_x0000_s1048" type="#_x0000_t202" style="position:absolute;left:0;text-align:left;margin-left:164pt;margin-top:767pt;width:138.5pt;height:23.3pt;z-index:251731968;visibility:visible;mso-wrap-style:square;mso-width-percent:0;mso-height-percent:0;mso-wrap-distance-left:9pt;mso-wrap-distance-top:3.6pt;mso-wrap-distance-right:9pt;mso-wrap-distance-bottom:3.6pt;mso-position-horizontal:absolute;mso-position-horizontal-relative:page;mso-position-vertical:absolute;mso-position-vertical-relative:page;mso-width-percent:0;mso-height-percent:0;mso-width-relative:margin;mso-height-relative:margin;v-text-anchor:top" o:gfxdata="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" strokecolor="white [3212]">
                 <v:textbox>
                   <w:txbxContent>
                     <w:p>
@@ -7584,16 +7440,7 @@
                         <w:jc w:val="center"/>
                       </w:pPr>
                       <w:r>
-                        <w:t>Slika 2</w:t>
-                      </w:r>
-                      <w:r>
-                        <w:t>2</w:t>
-                      </w:r>
-                      <w:r>
-                        <w:t xml:space="preserve">. </w:t>
-                      </w:r>
-                      <w:r>
-                        <w:t>Prodaja tura</w:t>
+                        <w:t>Slika 22. Prodaja tura</w:t>
                       </w:r>
                     </w:p>
                   </w:txbxContent>
@@ -7613,13 +7460,13 @@
         <mc:AlternateContent>
           <mc:Choice Requires="wps">
             <w:drawing>
-              <wp:anchor distT="45720" distB="45720" distL="114300" distR="114300" simplePos="0" relativeHeight="251729920" behindDoc="0" locked="0" layoutInCell="1" allowOverlap="1" wp14:anchorId="12159D8D" wp14:editId="0DC21348">
+              <wp:anchor distT="45720" distB="45720" distL="114300" distR="114300" simplePos="0" relativeHeight="251729920" behindDoc="0" locked="0" layoutInCell="1" allowOverlap="1" wp14:anchorId="12159D8D" wp14:editId="69739B27">
                 <wp:simplePos x="0" y="0"/>
                 <wp:positionH relativeFrom="page">
-                  <wp:posOffset>187688</wp:posOffset>
+                  <wp:align>left</wp:align>
                 </wp:positionH>
                 <wp:positionV relativeFrom="page">
-                  <wp:posOffset>9734550</wp:posOffset>
+                  <wp:align>bottom</wp:align>
                 </wp:positionV>
                 <wp:extent cx="1955800" cy="295910"/>
                 <wp:effectExtent l="0" t="0" r="25400" b="27940"/>
@@ -7661,16 +7508,7 @@
                               <w:jc w:val="center"/>
                             </w:pPr>
                             <w:r>
-                              <w:t xml:space="preserve">Slika </w:t>
-                            </w:r>
-                            <w:r>
-                              <w:t>21</w:t>
-                            </w:r>
-                            <w:r>
-                              <w:t>.</w:t>
-                            </w:r>
-                            <w:r>
-                              <w:t xml:space="preserve"> Hamburger meni</w:t>
+                              <w:t>Slika 21. Hamburger meni</w:t>
                             </w:r>
                           </w:p>
                         </w:txbxContent>
@@ -7692,7 +7530,7 @@
           </mc:Choice>
           <mc:Fallback>
             <w:pict>
-              <v:shape w14:anchorId="12159D8D" id="_x0000_s1048" type="#_x0000_t202" style="position:absolute;left:0;text-align:left;margin-left:14.8pt;margin-top:766.5pt;width:154pt;height:23.3pt;z-index:251729920;visibility:visible;mso-wrap-style:square;mso-width-percent:0;mso-height-percent:0;mso-wrap-distance-left:9pt;mso-wrap-distance-top:3.6pt;mso-wrap-distance-right:9pt;mso-wrap-distance-bottom:3.6pt;mso-position-horizontal:absolute;mso-position-horizontal-relative:page;mso-position-vertical:absolute;mso-position-vertical-relative:page;mso-width-percent:0;mso-height-percent:0;mso-width-relative:margin;mso-height-relative:margin;v-text-anchor:top" o:gfxdata="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" strokecolor="white [3212]">
+              <v:shape w14:anchorId="12159D8D" id="_x0000_s1049" type="#_x0000_t202" style="position:absolute;left:0;text-align:left;margin-left:0;margin-top:0;width:154pt;height:23.3pt;z-index:251729920;visibility:visible;mso-wrap-style:square;mso-width-percent:0;mso-height-percent:0;mso-wrap-distance-left:9pt;mso-wrap-distance-top:3.6pt;mso-wrap-distance-right:9pt;mso-wrap-distance-bottom:3.6pt;mso-position-horizontal:left;mso-position-horizontal-relative:page;mso-position-vertical:bottom;mso-position-vertical-relative:page;mso-width-percent:0;mso-height-percent:0;mso-width-relative:margin;mso-height-relative:margin;v-text-anchor:top" o:gfxdata="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" strokecolor="white [3212]">
                 <v:textbox>
                   <w:txbxContent>
                     <w:p>
@@ -7700,16 +7538,7 @@
                         <w:jc w:val="center"/>
                       </w:pPr>
                       <w:r>
-                        <w:t xml:space="preserve">Slika </w:t>
-                      </w:r>
-                      <w:r>
-                        <w:t>21</w:t>
-                      </w:r>
-                      <w:r>
-                        <w:t>.</w:t>
-                      </w:r>
-                      <w:r>
-                        <w:t xml:space="preserve"> Hamburger meni</w:t>
+                        <w:t>Slika 21. Hamburger meni</w:t>
                       </w:r>
                     </w:p>
                   </w:txbxContent>
@@ -7720,6 +7549,223 @@
           </mc:Fallback>
         </mc:AlternateContent>
       </w:r>
+    </w:p>
+    <w:p>
+      <w:pPr>
+        <w:jc w:val="both"/>
+        <w:rPr>
+          <w:sz w:val="24"/>
+          <w:szCs w:val="24"/>
+        </w:rPr>
+      </w:pPr>
+      <w:r>
+        <w:rPr>
+          <w:sz w:val="24"/>
+          <w:szCs w:val="24"/>
+        </w:rPr>
+        <w:lastRenderedPageBreak/>
+        <w:t>Zahtevi, o kojima je prethodno bilo reči, predstavljaju početni element u ovom procesu prodaje. Zahtev za transport dolazi od klijenta, koji ga šalje preko e-maila, a dispečer kada dobije tu poštu, on u aplikaciji unosi podatke o tom zahtevu I kasnije kreira ponudu za klijenta. Na dispečerovom interfejsu nalazi se dugme “Novi zahtev”, koji služi za kreiranje novog zahteva. Prilikom klika na to dugme, sistem dispečera odvodi na drugi ekran</w:t>
+      </w:r>
+      <w:r>
+        <w:rPr>
+          <w:sz w:val="24"/>
+          <w:szCs w:val="24"/>
+        </w:rPr>
+        <w:t>(Slika 25.)</w:t>
+      </w:r>
+      <w:r>
+        <w:rPr>
+          <w:sz w:val="24"/>
+          <w:szCs w:val="24"/>
+        </w:rPr>
+        <w:t xml:space="preserve">, gde mu se pojavljuje lista sa već postojećim klijentima firme, gde može da izabere klijenta I posle u dole postavljenim poljima, da unosi podatke o tom zahtevu(količina, vrsta robe, vreme, datum,…). Nakon unosa podataka, dispečer klikće na dugme “Sačuvaj”, koje se nalazi u donjem levom uglu I prilikom klika na to dugme, podaci se automatski evidentiraju u bazi, a sistem dispečera vraća na ekran “Prodaje ture” I tu se onda primećuje ažurirana kartica </w:t>
+      </w:r>
+      <w:r>
+        <w:rPr>
+          <w:sz w:val="24"/>
+          <w:szCs w:val="24"/>
+        </w:rPr>
+        <w:t xml:space="preserve">sa </w:t>
+      </w:r>
+      <w:r>
+        <w:rPr>
+          <w:sz w:val="24"/>
+          <w:szCs w:val="24"/>
+        </w:rPr>
+        <w:t>novim zahtevima I takođe lista sa zahtevima. Ukoliko dispečer želi da otkaže zahtev, klikom na dugme u donjem desnom uglu, “Otkaži”, on otkazuje zahtev I vraća se na stranicu “Prodaja ture”. Ukoliko klijenta nema u listi klijenata, odnosno, firma prvi put posluje sa tim klijentom, dispečer ima opciju da klikne na dugme “Dodaj klijenta” I na taj način ga sistem odvodi na stranicu, gde dispečer unosi podatke o novom klijentu I klikće zatim na dugme “Sačuvaj klijenta”</w:t>
+      </w:r>
+      <w:r>
+        <w:rPr>
+          <w:sz w:val="24"/>
+          <w:szCs w:val="24"/>
+        </w:rPr>
+        <w:t>(Slika 26.)</w:t>
+      </w:r>
+      <w:r>
+        <w:rPr>
+          <w:sz w:val="24"/>
+          <w:szCs w:val="24"/>
+        </w:rPr>
+        <w:t>. Klikom na to dugme, podaci se automatski evidentiraju u bazi</w:t>
+      </w:r>
+      <w:r>
+        <w:rPr>
+          <w:sz w:val="24"/>
+          <w:szCs w:val="24"/>
+        </w:rPr>
+        <w:t xml:space="preserve">, a sistem dispečera vraća na stranicu za dodavanje zahteva, gde se u okviru liste klijenata ažurira, odnosno dodaje novi klijent(Slika 27). Postoji takođe I dugme “Otkaži”, klikom na njega otkazuje se unos klijenta I sistem dispečera vraća na stranicu upisa zahteva. </w:t>
+      </w:r>
+    </w:p>
+    <w:p>
+      <w:pPr>
+        <w:jc w:val="both"/>
+        <w:rPr>
+          <w:sz w:val="24"/>
+          <w:szCs w:val="24"/>
+        </w:rPr>
+      </w:pPr>
+      <w:r>
+        <w:rPr>
+          <w:noProof/>
+          <w:sz w:val="24"/>
+          <w:szCs w:val="24"/>
+        </w:rPr>
+        <w:drawing>
+          <wp:anchor distT="0" distB="0" distL="114300" distR="114300" simplePos="0" relativeHeight="251743232" behindDoc="1" locked="0" layoutInCell="1" allowOverlap="1" wp14:anchorId="006E72A5" wp14:editId="6341DEBF">
+            <wp:simplePos x="0" y="0"/>
+            <wp:positionH relativeFrom="margin">
+              <wp:align>right</wp:align>
+            </wp:positionH>
+            <wp:positionV relativeFrom="page">
+              <wp:posOffset>4909820</wp:posOffset>
+            </wp:positionV>
+            <wp:extent cx="1310640" cy="2834640"/>
+            <wp:effectExtent l="0" t="0" r="3810" b="3810"/>
+            <wp:wrapTight wrapText="bothSides">
+              <wp:wrapPolygon edited="0">
+                <wp:start x="0" y="0"/>
+                <wp:lineTo x="0" y="21484"/>
+                <wp:lineTo x="21349" y="21484"/>
+                <wp:lineTo x="21349" y="0"/>
+                <wp:lineTo x="0" y="0"/>
+              </wp:wrapPolygon>
+            </wp:wrapTight>
+            <wp:docPr id="41" name="Picture 41"/>
+            <wp:cNvGraphicFramePr>
+              <a:graphicFrameLocks xmlns:a="http://schemas.openxmlformats.org/drawingml/2006/main" noChangeAspect="1"/>
+            </wp:cNvGraphicFramePr>
+            <a:graphic xmlns:a="http://schemas.openxmlformats.org/drawingml/2006/main">
+              <a:graphicData uri="http://schemas.openxmlformats.org/drawingml/2006/picture">
+                <pic:pic xmlns:pic="http://schemas.openxmlformats.org/drawingml/2006/picture">
+                  <pic:nvPicPr>
+                    <pic:cNvPr id="0" name="Picture 2"/>
+                    <pic:cNvPicPr>
+                      <a:picLocks noChangeAspect="1" noChangeArrowheads="1"/>
+                    </pic:cNvPicPr>
+                  </pic:nvPicPr>
+                  <pic:blipFill>
+                    <a:blip r:embed="rId33" cstate="print">
+                      <a:extLst>
+                        <a:ext uri="{28A0092B-C50C-407E-A947-70E740481C1C}">
+                          <a14:useLocalDpi xmlns:a14="http://schemas.microsoft.com/office/drawing/2010/main" val="0"/>
+                        </a:ext>
+                      </a:extLst>
+                    </a:blip>
+                    <a:srcRect/>
+                    <a:stretch>
+                      <a:fillRect/>
+                    </a:stretch>
+                  </pic:blipFill>
+                  <pic:spPr bwMode="auto">
+                    <a:xfrm>
+                      <a:off x="0" y="0"/>
+                      <a:ext cx="1310640" cy="2834640"/>
+                    </a:xfrm>
+                    <a:prstGeom prst="rect">
+                      <a:avLst/>
+                    </a:prstGeom>
+                    <a:noFill/>
+                    <a:ln>
+                      <a:noFill/>
+                    </a:ln>
+                  </pic:spPr>
+                </pic:pic>
+              </a:graphicData>
+            </a:graphic>
+          </wp:anchor>
+        </w:drawing>
+      </w:r>
+      <w:r>
+        <w:rPr>
+          <w:noProof/>
+          <w:sz w:val="24"/>
+          <w:szCs w:val="24"/>
+        </w:rPr>
+        <w:drawing>
+          <wp:anchor distT="0" distB="0" distL="114300" distR="114300" simplePos="0" relativeHeight="251744256" behindDoc="1" locked="0" layoutInCell="1" allowOverlap="1" wp14:anchorId="420BF955" wp14:editId="12FCCDF8">
+            <wp:simplePos x="0" y="0"/>
+            <wp:positionH relativeFrom="margin">
+              <wp:posOffset>2320290</wp:posOffset>
+            </wp:positionH>
+            <wp:positionV relativeFrom="page">
+              <wp:posOffset>4890770</wp:posOffset>
+            </wp:positionV>
+            <wp:extent cx="1310640" cy="2834640"/>
+            <wp:effectExtent l="0" t="0" r="3810" b="3810"/>
+            <wp:wrapTight wrapText="bothSides">
+              <wp:wrapPolygon edited="0">
+                <wp:start x="0" y="0"/>
+                <wp:lineTo x="0" y="21484"/>
+                <wp:lineTo x="21349" y="21484"/>
+                <wp:lineTo x="21349" y="0"/>
+                <wp:lineTo x="0" y="0"/>
+              </wp:wrapPolygon>
+            </wp:wrapTight>
+            <wp:docPr id="22" name="Picture 22"/>
+            <wp:cNvGraphicFramePr>
+              <a:graphicFrameLocks xmlns:a="http://schemas.openxmlformats.org/drawingml/2006/main" noChangeAspect="1"/>
+            </wp:cNvGraphicFramePr>
+            <a:graphic xmlns:a="http://schemas.openxmlformats.org/drawingml/2006/main">
+              <a:graphicData uri="http://schemas.openxmlformats.org/drawingml/2006/picture">
+                <pic:pic xmlns:pic="http://schemas.openxmlformats.org/drawingml/2006/picture">
+                  <pic:nvPicPr>
+                    <pic:cNvPr id="0" name="Picture 1"/>
+                    <pic:cNvPicPr>
+                      <a:picLocks noChangeAspect="1" noChangeArrowheads="1"/>
+                    </pic:cNvPicPr>
+                  </pic:nvPicPr>
+                  <pic:blipFill>
+                    <a:blip r:embed="rId34" cstate="print">
+                      <a:extLst>
+                        <a:ext uri="{28A0092B-C50C-407E-A947-70E740481C1C}">
+                          <a14:useLocalDpi xmlns:a14="http://schemas.microsoft.com/office/drawing/2010/main" val="0"/>
+                        </a:ext>
+                      </a:extLst>
+                    </a:blip>
+                    <a:srcRect/>
+                    <a:stretch>
+                      <a:fillRect/>
+                    </a:stretch>
+                  </pic:blipFill>
+                  <pic:spPr bwMode="auto">
+                    <a:xfrm>
+                      <a:off x="0" y="0"/>
+                      <a:ext cx="1310640" cy="2834640"/>
+                    </a:xfrm>
+                    <a:prstGeom prst="rect">
+                      <a:avLst/>
+                    </a:prstGeom>
+                    <a:noFill/>
+                    <a:ln>
+                      <a:noFill/>
+                    </a:ln>
+                  </pic:spPr>
+                </pic:pic>
+              </a:graphicData>
+            </a:graphic>
+          </wp:anchor>
+        </w:drawing>
+      </w:r>
       <w:r>
         <w:rPr>
           <w:noProof/>
@@ -7729,18 +7775,18 @@
         <mc:AlternateContent>
           <mc:Choice Requires="wps">
             <w:drawing>
-              <wp:anchor distT="45720" distB="45720" distL="114300" distR="114300" simplePos="0" relativeHeight="251741184" behindDoc="0" locked="0" layoutInCell="1" allowOverlap="1" wp14:anchorId="581C9DEB" wp14:editId="3F16D708">
+              <wp:anchor distT="45720" distB="45720" distL="114300" distR="114300" simplePos="0" relativeHeight="251750400" behindDoc="0" locked="0" layoutInCell="1" allowOverlap="1" wp14:anchorId="682C6426" wp14:editId="49102165">
                 <wp:simplePos x="0" y="0"/>
                 <wp:positionH relativeFrom="page">
-                  <wp:posOffset>5928451</wp:posOffset>
+                  <wp:posOffset>5600700</wp:posOffset>
                 </wp:positionH>
                 <wp:positionV relativeFrom="page">
-                  <wp:align>bottom</wp:align>
+                  <wp:posOffset>7753350</wp:posOffset>
                 </wp:positionV>
                 <wp:extent cx="1219200" cy="295910"/>
                 <wp:effectExtent l="0" t="0" r="19050" b="27940"/>
                 <wp:wrapSquare wrapText="bothSides"/>
-                <wp:docPr id="51" name="Text Box 2"/>
+                <wp:docPr id="54" name="Text Box 2"/>
                 <wp:cNvGraphicFramePr>
                   <a:graphicFrameLocks xmlns:a="http://schemas.openxmlformats.org/drawingml/2006/main"/>
                 </wp:cNvGraphicFramePr>
@@ -7780,7 +7826,7 @@
                               <w:t>Slika 2</w:t>
                             </w:r>
                             <w:r>
-                              <w:t>4</w:t>
+                              <w:t>7</w:t>
                             </w:r>
                             <w:r>
                               <w:t>.</w:t>
@@ -7805,7 +7851,7 @@
           </mc:Choice>
           <mc:Fallback>
             <w:pict>
-              <v:shape w14:anchorId="581C9DEB" id="_x0000_s1049" type="#_x0000_t202" style="position:absolute;left:0;text-align:left;margin-left:466.8pt;margin-top:0;width:96pt;height:23.3pt;z-index:251741184;visibility:visible;mso-wrap-style:square;mso-width-percent:0;mso-height-percent:0;mso-wrap-distance-left:9pt;mso-wrap-distance-top:3.6pt;mso-wrap-distance-right:9pt;mso-wrap-distance-bottom:3.6pt;mso-position-horizontal:absolute;mso-position-horizontal-relative:page;mso-position-vertical:bottom;mso-position-vertical-relative:page;mso-width-percent:0;mso-height-percent:0;mso-width-relative:margin;mso-height-relative:margin;v-text-anchor:top" o:gfxdata="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" strokecolor="white [3212]">
+              <v:shape w14:anchorId="682C6426" id="_x0000_s1050" type="#_x0000_t202" style="position:absolute;left:0;text-align:left;margin-left:441pt;margin-top:610.5pt;width:96pt;height:23.3pt;z-index:251750400;visibility:visible;mso-wrap-style:square;mso-width-percent:0;mso-height-percent:0;mso-wrap-distance-left:9pt;mso-wrap-distance-top:3.6pt;mso-wrap-distance-right:9pt;mso-wrap-distance-bottom:3.6pt;mso-position-horizontal:absolute;mso-position-horizontal-relative:page;mso-position-vertical:absolute;mso-position-vertical-relative:page;mso-width-percent:0;mso-height-percent:0;mso-width-relative:margin;mso-height-relative:margin;v-text-anchor:top" o:gfxdata="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" strokecolor="white [3212]">
                 <v:textbox>
                   <w:txbxContent>
                     <w:p>
@@ -7816,7 +7862,7 @@
                         <w:t>Slika 2</w:t>
                       </w:r>
                       <w:r>
-                        <w:t>4</w:t>
+                        <w:t>7</w:t>
                       </w:r>
                       <w:r>
                         <w:t>.</w:t>
@@ -7829,6 +7875,573 @@
             </w:pict>
           </mc:Fallback>
         </mc:AlternateContent>
+      </w:r>
+      <w:r>
+        <w:rPr>
+          <w:noProof/>
+          <w:sz w:val="36"/>
+          <w:szCs w:val="36"/>
+        </w:rPr>
+        <mc:AlternateContent>
+          <mc:Choice Requires="wps">
+            <w:drawing>
+              <wp:anchor distT="45720" distB="45720" distL="114300" distR="114300" simplePos="0" relativeHeight="251748352" behindDoc="0" locked="0" layoutInCell="1" allowOverlap="1" wp14:anchorId="0657EAB6" wp14:editId="650ADF18">
+                <wp:simplePos x="0" y="0"/>
+                <wp:positionH relativeFrom="page">
+                  <wp:posOffset>3223260</wp:posOffset>
+                </wp:positionH>
+                <wp:positionV relativeFrom="page">
+                  <wp:posOffset>7745730</wp:posOffset>
+                </wp:positionV>
+                <wp:extent cx="1219200" cy="295910"/>
+                <wp:effectExtent l="0" t="0" r="19050" b="27940"/>
+                <wp:wrapSquare wrapText="bothSides"/>
+                <wp:docPr id="53" name="Text Box 2"/>
+                <wp:cNvGraphicFramePr>
+                  <a:graphicFrameLocks xmlns:a="http://schemas.openxmlformats.org/drawingml/2006/main"/>
+                </wp:cNvGraphicFramePr>
+                <a:graphic xmlns:a="http://schemas.openxmlformats.org/drawingml/2006/main">
+                  <a:graphicData uri="http://schemas.microsoft.com/office/word/2010/wordprocessingShape">
+                    <wps:wsp>
+                      <wps:cNvSpPr txBox="1">
+                        <a:spLocks noChangeArrowheads="1"/>
+                      </wps:cNvSpPr>
+                      <wps:spPr bwMode="auto">
+                        <a:xfrm>
+                          <a:off x="0" y="0"/>
+                          <a:ext cx="1219200" cy="295910"/>
+                        </a:xfrm>
+                        <a:prstGeom prst="rect">
+                          <a:avLst/>
+                        </a:prstGeom>
+                        <a:solidFill>
+                          <a:srgbClr val="FFFFFF"/>
+                        </a:solidFill>
+                        <a:ln w="9525">
+                          <a:solidFill>
+                            <a:schemeClr val="bg1"/>
+                          </a:solidFill>
+                          <a:miter lim="800000"/>
+                          <a:headEnd/>
+                          <a:tailEnd/>
+                        </a:ln>
+                      </wps:spPr>
+                      <wps:txbx>
+                        <w:txbxContent>
+                          <w:p>
+                            <w:pPr>
+                              <w:jc w:val="center"/>
+                            </w:pPr>
+                            <w:r>
+                              <w:t>Slika 2</w:t>
+                            </w:r>
+                            <w:r>
+                              <w:t>6</w:t>
+                            </w:r>
+                            <w:r>
+                              <w:t>.</w:t>
+                            </w:r>
+                          </w:p>
+                        </w:txbxContent>
+                      </wps:txbx>
+                      <wps:bodyPr rot="0" vert="horz" wrap="square" lIns="91440" tIns="45720" rIns="91440" bIns="45720" anchor="t" anchorCtr="0">
+                        <a:noAutofit/>
+                      </wps:bodyPr>
+                    </wps:wsp>
+                  </a:graphicData>
+                </a:graphic>
+                <wp14:sizeRelH relativeFrom="margin">
+                  <wp14:pctWidth>0</wp14:pctWidth>
+                </wp14:sizeRelH>
+                <wp14:sizeRelV relativeFrom="margin">
+                  <wp14:pctHeight>0</wp14:pctHeight>
+                </wp14:sizeRelV>
+              </wp:anchor>
+            </w:drawing>
+          </mc:Choice>
+          <mc:Fallback>
+            <w:pict>
+              <v:shape w14:anchorId="0657EAB6" id="_x0000_s1051" type="#_x0000_t202" style="position:absolute;left:0;text-align:left;margin-left:253.8pt;margin-top:609.9pt;width:96pt;height:23.3pt;z-index:251748352;visibility:visible;mso-wrap-style:square;mso-width-percent:0;mso-height-percent:0;mso-wrap-distance-left:9pt;mso-wrap-distance-top:3.6pt;mso-wrap-distance-right:9pt;mso-wrap-distance-bottom:3.6pt;mso-position-horizontal:absolute;mso-position-horizontal-relative:page;mso-position-vertical:absolute;mso-position-vertical-relative:page;mso-width-percent:0;mso-height-percent:0;mso-width-relative:margin;mso-height-relative:margin;v-text-anchor:top" o:gfxdata="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" strokecolor="white [3212]">
+                <v:textbox>
+                  <w:txbxContent>
+                    <w:p>
+                      <w:pPr>
+                        <w:jc w:val="center"/>
+                      </w:pPr>
+                      <w:r>
+                        <w:t>Slika 2</w:t>
+                      </w:r>
+                      <w:r>
+                        <w:t>6</w:t>
+                      </w:r>
+                      <w:r>
+                        <w:t>.</w:t>
+                      </w:r>
+                    </w:p>
+                  </w:txbxContent>
+                </v:textbox>
+                <w10:wrap type="square" anchorx="page" anchory="page"/>
+              </v:shape>
+            </w:pict>
+          </mc:Fallback>
+        </mc:AlternateContent>
+      </w:r>
+      <w:r>
+        <w:rPr>
+          <w:noProof/>
+          <w:sz w:val="36"/>
+          <w:szCs w:val="36"/>
+        </w:rPr>
+        <mc:AlternateContent>
+          <mc:Choice Requires="wps">
+            <w:drawing>
+              <wp:anchor distT="45720" distB="45720" distL="114300" distR="114300" simplePos="0" relativeHeight="251746304" behindDoc="0" locked="0" layoutInCell="1" allowOverlap="1" wp14:anchorId="34AB59BB" wp14:editId="0EEA3FA7">
+                <wp:simplePos x="0" y="0"/>
+                <wp:positionH relativeFrom="page">
+                  <wp:posOffset>960120</wp:posOffset>
+                </wp:positionH>
+                <wp:positionV relativeFrom="page">
+                  <wp:posOffset>7738110</wp:posOffset>
+                </wp:positionV>
+                <wp:extent cx="1219200" cy="295910"/>
+                <wp:effectExtent l="0" t="0" r="19050" b="27940"/>
+                <wp:wrapSquare wrapText="bothSides"/>
+                <wp:docPr id="52" name="Text Box 2"/>
+                <wp:cNvGraphicFramePr>
+                  <a:graphicFrameLocks xmlns:a="http://schemas.openxmlformats.org/drawingml/2006/main"/>
+                </wp:cNvGraphicFramePr>
+                <a:graphic xmlns:a="http://schemas.openxmlformats.org/drawingml/2006/main">
+                  <a:graphicData uri="http://schemas.microsoft.com/office/word/2010/wordprocessingShape">
+                    <wps:wsp>
+                      <wps:cNvSpPr txBox="1">
+                        <a:spLocks noChangeArrowheads="1"/>
+                      </wps:cNvSpPr>
+                      <wps:spPr bwMode="auto">
+                        <a:xfrm>
+                          <a:off x="0" y="0"/>
+                          <a:ext cx="1219200" cy="295910"/>
+                        </a:xfrm>
+                        <a:prstGeom prst="rect">
+                          <a:avLst/>
+                        </a:prstGeom>
+                        <a:solidFill>
+                          <a:srgbClr val="FFFFFF"/>
+                        </a:solidFill>
+                        <a:ln w="9525">
+                          <a:solidFill>
+                            <a:schemeClr val="bg1"/>
+                          </a:solidFill>
+                          <a:miter lim="800000"/>
+                          <a:headEnd/>
+                          <a:tailEnd/>
+                        </a:ln>
+                      </wps:spPr>
+                      <wps:txbx>
+                        <w:txbxContent>
+                          <w:p>
+                            <w:pPr>
+                              <w:jc w:val="center"/>
+                            </w:pPr>
+                            <w:r>
+                              <w:t>Slika 2</w:t>
+                            </w:r>
+                            <w:r>
+                              <w:t>5</w:t>
+                            </w:r>
+                            <w:r>
+                              <w:t>.</w:t>
+                            </w:r>
+                          </w:p>
+                        </w:txbxContent>
+                      </wps:txbx>
+                      <wps:bodyPr rot="0" vert="horz" wrap="square" lIns="91440" tIns="45720" rIns="91440" bIns="45720" anchor="t" anchorCtr="0">
+                        <a:noAutofit/>
+                      </wps:bodyPr>
+                    </wps:wsp>
+                  </a:graphicData>
+                </a:graphic>
+                <wp14:sizeRelH relativeFrom="margin">
+                  <wp14:pctWidth>0</wp14:pctWidth>
+                </wp14:sizeRelH>
+                <wp14:sizeRelV relativeFrom="margin">
+                  <wp14:pctHeight>0</wp14:pctHeight>
+                </wp14:sizeRelV>
+              </wp:anchor>
+            </w:drawing>
+          </mc:Choice>
+          <mc:Fallback>
+            <w:pict>
+              <v:shape w14:anchorId="34AB59BB" id="_x0000_s1052" type="#_x0000_t202" style="position:absolute;left:0;text-align:left;margin-left:75.6pt;margin-top:609.3pt;width:96pt;height:23.3pt;z-index:251746304;visibility:visible;mso-wrap-style:square;mso-width-percent:0;mso-height-percent:0;mso-wrap-distance-left:9pt;mso-wrap-distance-top:3.6pt;mso-wrap-distance-right:9pt;mso-wrap-distance-bottom:3.6pt;mso-position-horizontal:absolute;mso-position-horizontal-relative:page;mso-position-vertical:absolute;mso-position-vertical-relative:page;mso-width-percent:0;mso-height-percent:0;mso-width-relative:margin;mso-height-relative:margin;v-text-anchor:top" o:gfxdata="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" strokecolor="white [3212]">
+                <v:textbox>
+                  <w:txbxContent>
+                    <w:p>
+                      <w:pPr>
+                        <w:jc w:val="center"/>
+                      </w:pPr>
+                      <w:r>
+                        <w:t>Slika 2</w:t>
+                      </w:r>
+                      <w:r>
+                        <w:t>5</w:t>
+                      </w:r>
+                      <w:r>
+                        <w:t>.</w:t>
+                      </w:r>
+                    </w:p>
+                  </w:txbxContent>
+                </v:textbox>
+                <w10:wrap type="square" anchorx="page" anchory="page"/>
+              </v:shape>
+            </w:pict>
+          </mc:Fallback>
+        </mc:AlternateContent>
+      </w:r>
+      <w:r>
+        <w:rPr>
+          <w:noProof/>
+          <w:sz w:val="24"/>
+          <w:szCs w:val="24"/>
+        </w:rPr>
+        <w:drawing>
+          <wp:anchor distT="0" distB="0" distL="114300" distR="114300" simplePos="0" relativeHeight="251742208" behindDoc="1" locked="0" layoutInCell="1" allowOverlap="1" wp14:anchorId="7DDBA840" wp14:editId="6AE59993">
+            <wp:simplePos x="0" y="0"/>
+            <wp:positionH relativeFrom="margin">
+              <wp:align>left</wp:align>
+            </wp:positionH>
+            <wp:positionV relativeFrom="page">
+              <wp:posOffset>4903177</wp:posOffset>
+            </wp:positionV>
+            <wp:extent cx="1310640" cy="2834640"/>
+            <wp:effectExtent l="0" t="0" r="3810" b="3810"/>
+            <wp:wrapTight wrapText="bothSides">
+              <wp:wrapPolygon edited="0">
+                <wp:start x="0" y="0"/>
+                <wp:lineTo x="0" y="21484"/>
+                <wp:lineTo x="21349" y="21484"/>
+                <wp:lineTo x="21349" y="0"/>
+                <wp:lineTo x="0" y="0"/>
+              </wp:wrapPolygon>
+            </wp:wrapTight>
+            <wp:docPr id="49" name="Picture 49"/>
+            <wp:cNvGraphicFramePr>
+              <a:graphicFrameLocks xmlns:a="http://schemas.openxmlformats.org/drawingml/2006/main" noChangeAspect="1"/>
+            </wp:cNvGraphicFramePr>
+            <a:graphic xmlns:a="http://schemas.openxmlformats.org/drawingml/2006/main">
+              <a:graphicData uri="http://schemas.openxmlformats.org/drawingml/2006/picture">
+                <pic:pic xmlns:pic="http://schemas.openxmlformats.org/drawingml/2006/picture">
+                  <pic:nvPicPr>
+                    <pic:cNvPr id="0" name="Picture 3"/>
+                    <pic:cNvPicPr>
+                      <a:picLocks noChangeAspect="1" noChangeArrowheads="1"/>
+                    </pic:cNvPicPr>
+                  </pic:nvPicPr>
+                  <pic:blipFill>
+                    <a:blip r:embed="rId35" cstate="print">
+                      <a:extLst>
+                        <a:ext uri="{28A0092B-C50C-407E-A947-70E740481C1C}">
+                          <a14:useLocalDpi xmlns:a14="http://schemas.microsoft.com/office/drawing/2010/main" val="0"/>
+                        </a:ext>
+                      </a:extLst>
+                    </a:blip>
+                    <a:srcRect/>
+                    <a:stretch>
+                      <a:fillRect/>
+                    </a:stretch>
+                  </pic:blipFill>
+                  <pic:spPr bwMode="auto">
+                    <a:xfrm>
+                      <a:off x="0" y="0"/>
+                      <a:ext cx="1310640" cy="2834640"/>
+                    </a:xfrm>
+                    <a:prstGeom prst="rect">
+                      <a:avLst/>
+                    </a:prstGeom>
+                    <a:noFill/>
+                    <a:ln>
+                      <a:noFill/>
+                    </a:ln>
+                  </pic:spPr>
+                </pic:pic>
+              </a:graphicData>
+            </a:graphic>
+          </wp:anchor>
+        </w:drawing>
+      </w:r>
+      <w:r>
+        <w:rPr>
+          <w:sz w:val="24"/>
+          <w:szCs w:val="24"/>
+        </w:rPr>
+        <w:br w:type="page"/>
+      </w:r>
+    </w:p>
+    <w:p>
+      <w:pPr>
+        <w:tabs>
+          <w:tab w:val="left" w:pos="1265"/>
+        </w:tabs>
+        <w:jc w:val="both"/>
+        <w:rPr>
+          <w:sz w:val="34"/>
+          <w:szCs w:val="34"/>
+        </w:rPr>
+      </w:pPr>
+      <w:r>
+        <w:rPr>
+          <w:sz w:val="34"/>
+          <w:szCs w:val="34"/>
+        </w:rPr>
+        <w:lastRenderedPageBreak/>
+        <w:t>4.</w:t>
+      </w:r>
+      <w:r>
+        <w:rPr>
+          <w:sz w:val="34"/>
+          <w:szCs w:val="34"/>
+        </w:rPr>
+        <w:t>4 Kreiranje I upravljanje ponudama</w:t>
+      </w:r>
+    </w:p>
+    <w:p>
+      <w:pPr>
+        <w:tabs>
+          <w:tab w:val="left" w:pos="1265"/>
+        </w:tabs>
+        <w:jc w:val="both"/>
+        <w:rPr>
+          <w:sz w:val="24"/>
+          <w:szCs w:val="24"/>
+        </w:rPr>
+      </w:pPr>
+      <w:r>
+        <w:rPr>
+          <w:sz w:val="24"/>
+          <w:szCs w:val="24"/>
+        </w:rPr>
+        <w:t>Nakon kreiranja zahteva, sledeći korak u našem procesu je kreiranje I slanje ponude klijentu. Kreiranje ponude se vrši tako što dispečer ulazi u detalje zahteva na osnovu kojeg želi da kreira ponudu. Na toj stranici, osim detalja zahteva, nalazi se I dugme “Kreiraj ponudu”. Klikom na to dugme, sistem odvodi dispečera na stranicu sa poljima za unos podataka I sa dugmićima “Sačuvaj ponudu”, “Pošalji ponudu” I “Otkaži”</w:t>
+      </w:r>
+      <w:r>
+        <w:rPr>
+          <w:sz w:val="24"/>
+          <w:szCs w:val="24"/>
+        </w:rPr>
+        <w:t>(Slika 28)</w:t>
+      </w:r>
+      <w:r>
+        <w:rPr>
+          <w:sz w:val="24"/>
+          <w:szCs w:val="24"/>
+        </w:rPr>
+        <w:t>. U poljima za unos podataka, dispečer unosi podatke, s tim da ime klijenta je već upisano. Nakon unosa podataka, klikće se dugme “Sačuvaj ponudu”, pa se time aktivira I dugme “Pošalji ponudu”. Nakon čuvanja, ponuda se može poslati. Kada se klikne dugme “Pošalji ponudu”, ponuda se</w:t>
+      </w:r>
+      <w:r>
+        <w:rPr>
+          <w:sz w:val="24"/>
+          <w:szCs w:val="24"/>
+        </w:rPr>
+        <w:t xml:space="preserve"> preko servera</w:t>
+      </w:r>
+      <w:r>
+        <w:rPr>
+          <w:sz w:val="24"/>
+          <w:szCs w:val="24"/>
+        </w:rPr>
+        <w:t xml:space="preserve"> šalje klijentu</w:t>
+      </w:r>
+      <w:r>
+        <w:rPr>
+          <w:sz w:val="24"/>
+          <w:szCs w:val="24"/>
+        </w:rPr>
+        <w:t xml:space="preserve"> na mail</w:t>
+      </w:r>
+      <w:r>
+        <w:rPr>
+          <w:sz w:val="24"/>
+          <w:szCs w:val="24"/>
+        </w:rPr>
+        <w:t xml:space="preserve">, a sistem dispečera vraća na stranicu “Prodaja ture” I u karticama za poslate ponude, se može videti ažurirani broj istih. Takođe, lista zahteva se ažurira. </w:t>
+      </w:r>
+    </w:p>
+    <w:p>
+      <w:pPr>
+        <w:tabs>
+          <w:tab w:val="left" w:pos="1265"/>
+        </w:tabs>
+        <w:jc w:val="both"/>
+        <w:rPr>
+          <w:sz w:val="24"/>
+          <w:szCs w:val="24"/>
+        </w:rPr>
+      </w:pPr>
+      <w:r>
+        <w:rPr>
+          <w:noProof/>
+          <w:sz w:val="36"/>
+          <w:szCs w:val="36"/>
+        </w:rPr>
+        <mc:AlternateContent>
+          <mc:Choice Requires="wps">
+            <w:drawing>
+              <wp:anchor distT="45720" distB="45720" distL="114300" distR="114300" simplePos="0" relativeHeight="251753472" behindDoc="0" locked="0" layoutInCell="1" allowOverlap="1" wp14:anchorId="178EA41F" wp14:editId="7882C5AD">
+                <wp:simplePos x="0" y="0"/>
+                <wp:positionH relativeFrom="page">
+                  <wp:posOffset>3090333</wp:posOffset>
+                </wp:positionH>
+                <wp:positionV relativeFrom="page">
+                  <wp:posOffset>6460913</wp:posOffset>
+                </wp:positionV>
+                <wp:extent cx="1219200" cy="295910"/>
+                <wp:effectExtent l="0" t="0" r="19050" b="27940"/>
+                <wp:wrapSquare wrapText="bothSides"/>
+                <wp:docPr id="57" name="Text Box 2"/>
+                <wp:cNvGraphicFramePr>
+                  <a:graphicFrameLocks xmlns:a="http://schemas.openxmlformats.org/drawingml/2006/main"/>
+                </wp:cNvGraphicFramePr>
+                <a:graphic xmlns:a="http://schemas.openxmlformats.org/drawingml/2006/main">
+                  <a:graphicData uri="http://schemas.microsoft.com/office/word/2010/wordprocessingShape">
+                    <wps:wsp>
+                      <wps:cNvSpPr txBox="1">
+                        <a:spLocks noChangeArrowheads="1"/>
+                      </wps:cNvSpPr>
+                      <wps:spPr bwMode="auto">
+                        <a:xfrm>
+                          <a:off x="0" y="0"/>
+                          <a:ext cx="1219200" cy="295910"/>
+                        </a:xfrm>
+                        <a:prstGeom prst="rect">
+                          <a:avLst/>
+                        </a:prstGeom>
+                        <a:solidFill>
+                          <a:srgbClr val="FFFFFF"/>
+                        </a:solidFill>
+                        <a:ln w="9525">
+                          <a:solidFill>
+                            <a:schemeClr val="bg1"/>
+                          </a:solidFill>
+                          <a:miter lim="800000"/>
+                          <a:headEnd/>
+                          <a:tailEnd/>
+                        </a:ln>
+                      </wps:spPr>
+                      <wps:txbx>
+                        <w:txbxContent>
+                          <w:p>
+                            <w:pPr>
+                              <w:jc w:val="center"/>
+                            </w:pPr>
+                            <w:r>
+                              <w:t>Slika 27.</w:t>
+                            </w:r>
+                          </w:p>
+                        </w:txbxContent>
+                      </wps:txbx>
+                      <wps:bodyPr rot="0" vert="horz" wrap="square" lIns="91440" tIns="45720" rIns="91440" bIns="45720" anchor="t" anchorCtr="0">
+                        <a:noAutofit/>
+                      </wps:bodyPr>
+                    </wps:wsp>
+                  </a:graphicData>
+                </a:graphic>
+                <wp14:sizeRelH relativeFrom="margin">
+                  <wp14:pctWidth>0</wp14:pctWidth>
+                </wp14:sizeRelH>
+                <wp14:sizeRelV relativeFrom="margin">
+                  <wp14:pctHeight>0</wp14:pctHeight>
+                </wp14:sizeRelV>
+              </wp:anchor>
+            </w:drawing>
+          </mc:Choice>
+          <mc:Fallback>
+            <w:pict>
+              <v:shape w14:anchorId="178EA41F" id="_x0000_s1053" type="#_x0000_t202" style="position:absolute;left:0;text-align:left;margin-left:243.35pt;margin-top:508.75pt;width:96pt;height:23.3pt;z-index:251753472;visibility:visible;mso-wrap-style:square;mso-width-percent:0;mso-height-percent:0;mso-wrap-distance-left:9pt;mso-wrap-distance-top:3.6pt;mso-wrap-distance-right:9pt;mso-wrap-distance-bottom:3.6pt;mso-position-horizontal:absolute;mso-position-horizontal-relative:page;mso-position-vertical:absolute;mso-position-vertical-relative:page;mso-width-percent:0;mso-height-percent:0;mso-width-relative:margin;mso-height-relative:margin;v-text-anchor:top" o:gfxdata="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" strokecolor="white [3212]">
+                <v:textbox>
+                  <w:txbxContent>
+                    <w:p>
+                      <w:pPr>
+                        <w:jc w:val="center"/>
+                      </w:pPr>
+                      <w:r>
+                        <w:t>Slika 27.</w:t>
+                      </w:r>
+                    </w:p>
+                  </w:txbxContent>
+                </v:textbox>
+                <w10:wrap type="square" anchorx="page" anchory="page"/>
+              </v:shape>
+            </w:pict>
+          </mc:Fallback>
+        </mc:AlternateContent>
+      </w:r>
+      <w:r>
+        <w:rPr>
+          <w:noProof/>
+          <w:sz w:val="24"/>
+          <w:szCs w:val="24"/>
+        </w:rPr>
+        <w:drawing>
+          <wp:anchor distT="0" distB="0" distL="114300" distR="114300" simplePos="0" relativeHeight="251751424" behindDoc="1" locked="0" layoutInCell="1" allowOverlap="1" wp14:anchorId="35D2C1BC" wp14:editId="3C854657">
+            <wp:simplePos x="0" y="0"/>
+            <wp:positionH relativeFrom="column">
+              <wp:posOffset>2144486</wp:posOffset>
+            </wp:positionH>
+            <wp:positionV relativeFrom="paragraph">
+              <wp:posOffset>192767</wp:posOffset>
+            </wp:positionV>
+            <wp:extent cx="1310334" cy="2834640"/>
+            <wp:effectExtent l="0" t="0" r="4445" b="3810"/>
+            <wp:wrapTight wrapText="bothSides">
+              <wp:wrapPolygon edited="0">
+                <wp:start x="0" y="0"/>
+                <wp:lineTo x="0" y="21484"/>
+                <wp:lineTo x="21359" y="21484"/>
+                <wp:lineTo x="21359" y="0"/>
+                <wp:lineTo x="0" y="0"/>
+              </wp:wrapPolygon>
+            </wp:wrapTight>
+            <wp:docPr id="55" name="Picture 55"/>
+            <wp:cNvGraphicFramePr>
+              <a:graphicFrameLocks xmlns:a="http://schemas.openxmlformats.org/drawingml/2006/main" noChangeAspect="1"/>
+            </wp:cNvGraphicFramePr>
+            <a:graphic xmlns:a="http://schemas.openxmlformats.org/drawingml/2006/main">
+              <a:graphicData uri="http://schemas.openxmlformats.org/drawingml/2006/picture">
+                <pic:pic xmlns:pic="http://schemas.openxmlformats.org/drawingml/2006/picture">
+                  <pic:nvPicPr>
+                    <pic:cNvPr id="0" name="Picture 4"/>
+                    <pic:cNvPicPr>
+                      <a:picLocks noChangeAspect="1" noChangeArrowheads="1"/>
+                    </pic:cNvPicPr>
+                  </pic:nvPicPr>
+                  <pic:blipFill>
+                    <a:blip r:embed="rId36" cstate="print">
+                      <a:extLst>
+                        <a:ext uri="{28A0092B-C50C-407E-A947-70E740481C1C}">
+                          <a14:useLocalDpi xmlns:a14="http://schemas.microsoft.com/office/drawing/2010/main" val="0"/>
+                        </a:ext>
+                      </a:extLst>
+                    </a:blip>
+                    <a:srcRect/>
+                    <a:stretch>
+                      <a:fillRect/>
+                    </a:stretch>
+                  </pic:blipFill>
+                  <pic:spPr bwMode="auto">
+                    <a:xfrm>
+                      <a:off x="0" y="0"/>
+                      <a:ext cx="1310334" cy="2834640"/>
+                    </a:xfrm>
+                    <a:prstGeom prst="rect">
+                      <a:avLst/>
+                    </a:prstGeom>
+                    <a:noFill/>
+                    <a:ln>
+                      <a:noFill/>
+                    </a:ln>
+                  </pic:spPr>
+                </pic:pic>
+              </a:graphicData>
+            </a:graphic>
+          </wp:anchor>
+        </w:drawing>
       </w:r>
     </w:p>
     <w:sectPr>
@@ -9116,4 +9729,16 @@
     </a:ext>
   </a:extLst>
 </a:theme>
+</file>
+
+<file path=customXml/item1.xml><?xml version="1.0" encoding="utf-8"?>
+<b:Sources xmlns:b="http://schemas.openxmlformats.org/officeDocument/2006/bibliography" xmlns="http://schemas.openxmlformats.org/officeDocument/2006/bibliography" SelectedStyle="\APASixthEditionOfficeOnline.xsl" StyleName="APA" Version="6"/>
+</file>
+
+<file path=customXml/itemProps1.xml><?xml version="1.0" encoding="utf-8"?>
+<ds:datastoreItem xmlns:ds="http://schemas.openxmlformats.org/officeDocument/2006/customXml" ds:itemID="{6A27E907-B432-419B-AA50-B5AA81508418}">
+  <ds:schemaRefs>
+    <ds:schemaRef ds:uri="http://schemas.openxmlformats.org/officeDocument/2006/bibliography"/>
+  </ds:schemaRefs>
+</ds:datastoreItem>
 </file>
</xml_diff>

<commit_message>
Korekcija plana za realizaciju
</commit_message>
<xml_diff>
--- a/predlog rešenja.docx
+++ b/predlog rešenja.docx
@@ -313,6 +313,12 @@
     </w:p>
     <w:sdt>
       <w:sdtPr>
+        <w:rPr>
+          <w:rFonts w:asciiTheme="minorHAnsi" w:eastAsiaTheme="minorHAnsi" w:hAnsiTheme="minorHAnsi" w:cstheme="minorBidi"/>
+          <w:color w:val="auto"/>
+          <w:sz w:val="22"/>
+          <w:szCs w:val="22"/>
+        </w:rPr>
         <w:id w:val="-221913582"/>
         <w:docPartObj>
           <w:docPartGallery w:val="Table of Contents"/>
@@ -321,13 +327,9 @@
       </w:sdtPr>
       <w:sdtEndPr>
         <w:rPr>
-          <w:rFonts w:asciiTheme="minorHAnsi" w:eastAsiaTheme="minorHAnsi" w:hAnsiTheme="minorHAnsi" w:cstheme="minorBidi"/>
           <w:b/>
           <w:bCs/>
           <w:noProof/>
-          <w:color w:val="auto"/>
-          <w:sz w:val="22"/>
-          <w:szCs w:val="22"/>
         </w:rPr>
       </w:sdtEndPr>
       <w:sdtContent>
@@ -1495,76 +1497,6 @@
               <w:noProof/>
             </w:rPr>
           </w:pPr>
-          <w:hyperlink w:anchor="_Toc227231933" w:history="1">
-            <w:r>
-              <w:rPr>
-                <w:rStyle w:val="Hyperlink"/>
-                <w:rFonts w:eastAsia="Times New Roman"/>
-                <w:noProof/>
-              </w:rPr>
-              <w:t>6. Plan realizacije aplikacije</w:t>
-            </w:r>
-            <w:r>
-              <w:rPr>
-                <w:noProof/>
-                <w:webHidden/>
-              </w:rPr>
-              <w:tab/>
-            </w:r>
-            <w:r>
-              <w:rPr>
-                <w:noProof/>
-                <w:webHidden/>
-              </w:rPr>
-              <w:fldChar w:fldCharType="begin"/>
-            </w:r>
-            <w:r>
-              <w:rPr>
-                <w:noProof/>
-                <w:webHidden/>
-              </w:rPr>
-              <w:instrText xml:space="preserve"> PAGEREF _Toc227231933 \h </w:instrText>
-            </w:r>
-            <w:r>
-              <w:rPr>
-                <w:noProof/>
-                <w:webHidden/>
-              </w:rPr>
-            </w:r>
-            <w:r>
-              <w:rPr>
-                <w:noProof/>
-                <w:webHidden/>
-              </w:rPr>
-              <w:fldChar w:fldCharType="separate"/>
-            </w:r>
-            <w:r>
-              <w:rPr>
-                <w:noProof/>
-                <w:webHidden/>
-              </w:rPr>
-              <w:t>24</w:t>
-            </w:r>
-            <w:r>
-              <w:rPr>
-                <w:noProof/>
-                <w:webHidden/>
-              </w:rPr>
-              <w:fldChar w:fldCharType="end"/>
-            </w:r>
-          </w:hyperlink>
-        </w:p>
-        <w:p>
-          <w:pPr>
-            <w:pStyle w:val="TOC1"/>
-            <w:tabs>
-              <w:tab w:val="right" w:leader="dot" w:pos="9350"/>
-            </w:tabs>
-            <w:rPr>
-              <w:rFonts w:eastAsiaTheme="minorEastAsia"/>
-              <w:noProof/>
-            </w:rPr>
-          </w:pPr>
           <w:hyperlink w:anchor="_Toc227231934" w:history="1">
             <w:r>
               <w:rPr>
@@ -1572,7 +1504,15 @@
                 <w:rFonts w:eastAsia="Times New Roman"/>
                 <w:noProof/>
               </w:rPr>
-              <w:t>7. Zaključak</w:t>
+              <w:t>6</w:t>
+            </w:r>
+            <w:r>
+              <w:rPr>
+                <w:rStyle w:val="Hyperlink"/>
+                <w:rFonts w:eastAsia="Times New Roman"/>
+                <w:noProof/>
+              </w:rPr>
+              <w:t>. Zaključak</w:t>
             </w:r>
             <w:r>
               <w:rPr>
@@ -1613,7 +1553,14 @@
                 <w:noProof/>
                 <w:webHidden/>
               </w:rPr>
-              <w:t>25</w:t>
+              <w:t>2</w:t>
+            </w:r>
+            <w:r>
+              <w:rPr>
+                <w:noProof/>
+                <w:webHidden/>
+              </w:rPr>
+              <w:t>4</w:t>
             </w:r>
             <w:r>
               <w:rPr>
@@ -13844,791 +13791,6 @@
           <w:szCs w:val="24"/>
         </w:rPr>
       </w:pPr>
-      <w:r>
-        <w:rPr>
-          <w:rFonts w:eastAsia="Times New Roman" w:cstheme="minorHAnsi"/>
-          <w:sz w:val="24"/>
-          <w:szCs w:val="24"/>
-        </w:rPr>
-        <w:br w:type="page"/>
-      </w:r>
-    </w:p>
-    <w:p>
-      <w:pPr>
-        <w:pStyle w:val="Heading1"/>
-        <w:rPr>
-          <w:rFonts w:eastAsia="Times New Roman"/>
-        </w:rPr>
-      </w:pPr>
-      <w:bookmarkStart w:id="61" w:name="_Toc227231933"/>
-      <w:r>
-        <w:rPr>
-          <w:rFonts w:eastAsia="Times New Roman"/>
-        </w:rPr>
-        <w:lastRenderedPageBreak/>
-        <w:t>6. Plan realizacije aplikacije</w:t>
-      </w:r>
-      <w:bookmarkEnd w:id="61"/>
-    </w:p>
-    <w:p/>
-    <w:p>
-      <w:pPr>
-        <w:pStyle w:val="isselectedend"/>
-        <w:jc w:val="both"/>
-        <w:rPr>
-          <w:rFonts w:asciiTheme="minorHAnsi" w:hAnsiTheme="minorHAnsi" w:cstheme="minorHAnsi"/>
-        </w:rPr>
-      </w:pPr>
-      <w:r>
-        <w:rPr>
-          <w:rFonts w:asciiTheme="minorHAnsi" w:hAnsiTheme="minorHAnsi" w:cstheme="minorHAnsi"/>
-        </w:rPr>
-        <w:t>Termin plan realizacije aplikacije prikazuje raspored aktivnosti u okviru razvoja sistema, organizovan po nedeljama</w:t>
-      </w:r>
-      <w:r>
-        <w:rPr>
-          <w:rFonts w:asciiTheme="minorHAnsi" w:hAnsiTheme="minorHAnsi" w:cstheme="minorHAnsi"/>
-        </w:rPr>
-        <w:t xml:space="preserve">. </w:t>
-      </w:r>
-      <w:r>
-        <w:rPr>
-          <w:rFonts w:asciiTheme="minorHAnsi" w:hAnsiTheme="minorHAnsi" w:cstheme="minorHAnsi"/>
-        </w:rPr>
-        <w:t>Plan obuhvata ključne faze implementacije aplikacije, počev od kreiranja baze podataka, preko razvoja funkcionalnosti, do testiranja i finalizacije sistema.</w:t>
-      </w:r>
-      <w:r>
-        <w:rPr>
-          <w:rFonts w:asciiTheme="minorHAnsi" w:hAnsiTheme="minorHAnsi" w:cstheme="minorHAnsi"/>
-        </w:rPr>
-        <w:t xml:space="preserve"> </w:t>
-      </w:r>
-      <w:r>
-        <w:rPr>
-          <w:rFonts w:asciiTheme="minorHAnsi" w:hAnsiTheme="minorHAnsi" w:cstheme="minorHAnsi"/>
-        </w:rPr>
-        <w:t>Aktivnosti su raspoređene hronološki, pri čemu svaka faza predstavlja logičnu celinu u procesu razvoja aplikacije. Pojedine aktivnosti mogu se delimično realizovati paralelno, u zavisnosti od složenosti zadataka i dostupnosti resursa.</w:t>
-      </w:r>
-    </w:p>
-    <w:p>
-      <w:pPr>
-        <w:pStyle w:val="isselectedend"/>
-        <w:jc w:val="both"/>
-        <w:rPr>
-          <w:rFonts w:asciiTheme="minorHAnsi" w:hAnsiTheme="minorHAnsi" w:cstheme="minorHAnsi"/>
-        </w:rPr>
-      </w:pPr>
-      <w:r>
-        <w:rPr>
-          <w:rFonts w:asciiTheme="minorHAnsi" w:hAnsiTheme="minorHAnsi" w:cstheme="minorHAnsi"/>
-        </w:rPr>
-        <w:t xml:space="preserve">Implementacija funkcija počinje od 16.4.2026, </w:t>
-      </w:r>
-      <w:r>
-        <w:rPr>
-          <w:rFonts w:asciiTheme="minorHAnsi" w:hAnsiTheme="minorHAnsi" w:cstheme="minorHAnsi"/>
-        </w:rPr>
-        <w:t xml:space="preserve">a cilj je da se sve planirane funkcionalnosti implementiraju i sistem završi </w:t>
-      </w:r>
-      <w:r>
-        <w:rPr>
-          <w:rFonts w:asciiTheme="minorHAnsi" w:hAnsiTheme="minorHAnsi" w:cstheme="minorHAnsi"/>
-        </w:rPr>
-        <w:t>najkasnije do sredine</w:t>
-      </w:r>
-      <w:r>
-        <w:rPr>
-          <w:rFonts w:asciiTheme="minorHAnsi" w:hAnsiTheme="minorHAnsi" w:cstheme="minorHAnsi"/>
-        </w:rPr>
-        <w:t xml:space="preserve"> juna, odnosno pre početka junskog ispitnog roka.</w:t>
-      </w:r>
-    </w:p>
-    <w:p>
-      <w:pPr>
-        <w:pStyle w:val="isselectedend"/>
-        <w:numPr>
-          <w:ilvl w:val="0"/>
-          <w:numId w:val="6"/>
-        </w:numPr>
-        <w:jc w:val="both"/>
-        <w:rPr>
-          <w:rFonts w:asciiTheme="minorHAnsi" w:hAnsiTheme="minorHAnsi" w:cstheme="minorHAnsi"/>
-        </w:rPr>
-      </w:pPr>
-      <w:r>
-        <w:rPr>
-          <w:rFonts w:asciiTheme="minorHAnsi" w:hAnsiTheme="minorHAnsi" w:cstheme="minorHAnsi"/>
-        </w:rPr>
-        <w:t>Razvoj: april-maj</w:t>
-      </w:r>
-    </w:p>
-    <w:p>
-      <w:pPr>
-        <w:pStyle w:val="isselectedend"/>
-        <w:numPr>
-          <w:ilvl w:val="0"/>
-          <w:numId w:val="6"/>
-        </w:numPr>
-        <w:jc w:val="both"/>
-        <w:rPr>
-          <w:rFonts w:asciiTheme="minorHAnsi" w:hAnsiTheme="minorHAnsi" w:cstheme="minorHAnsi"/>
-        </w:rPr>
-      </w:pPr>
-      <w:r>
-        <w:rPr>
-          <w:rFonts w:asciiTheme="minorHAnsi" w:hAnsiTheme="minorHAnsi" w:cstheme="minorHAnsi"/>
-        </w:rPr>
-        <w:t>Završetak implememtacije: kraj maja-početak juna</w:t>
-      </w:r>
-    </w:p>
-    <w:p>
-      <w:pPr>
-        <w:pStyle w:val="isselectedend"/>
-        <w:numPr>
-          <w:ilvl w:val="0"/>
-          <w:numId w:val="6"/>
-        </w:numPr>
-        <w:jc w:val="both"/>
-        <w:rPr>
-          <w:rFonts w:asciiTheme="minorHAnsi" w:hAnsiTheme="minorHAnsi" w:cstheme="minorHAnsi"/>
-        </w:rPr>
-      </w:pPr>
-      <w:r>
-        <w:rPr>
-          <w:rFonts w:asciiTheme="minorHAnsi" w:hAnsiTheme="minorHAnsi" w:cstheme="minorHAnsi"/>
-        </w:rPr>
-        <w:t>Finalizacija: sredina juna</w:t>
-      </w:r>
-    </w:p>
-    <w:p/>
-    <w:tbl>
-      <w:tblPr>
-        <w:tblStyle w:val="TableGrid"/>
-        <w:tblpPr w:leftFromText="180" w:rightFromText="180" w:vertAnchor="page" w:horzAnchor="margin" w:tblpXSpec="center" w:tblpY="7548"/>
-        <w:tblW w:w="6205" w:type="dxa"/>
-        <w:tblLook w:val="04A0" w:firstRow="1" w:lastRow="0" w:firstColumn="1" w:lastColumn="0" w:noHBand="0" w:noVBand="1"/>
-      </w:tblPr>
-      <w:tblGrid>
-        <w:gridCol w:w="1795"/>
-        <w:gridCol w:w="4410"/>
-      </w:tblGrid>
-      <w:tr>
-        <w:trPr>
-          <w:trHeight w:val="421"/>
-        </w:trPr>
-        <w:tc>
-          <w:tcPr>
-            <w:tcW w:w="1795" w:type="dxa"/>
-            <w:tcBorders>
-              <w:bottom w:val="single" w:sz="4" w:space="0" w:color="auto"/>
-            </w:tcBorders>
-          </w:tcPr>
-          <w:p>
-            <w:pPr>
-              <w:jc w:val="center"/>
-              <w:rPr>
-                <w:rFonts w:eastAsia="Times New Roman" w:cstheme="minorHAnsi"/>
-                <w:b/>
-                <w:bCs/>
-                <w:sz w:val="24"/>
-                <w:szCs w:val="24"/>
-              </w:rPr>
-            </w:pPr>
-            <w:r>
-              <w:rPr>
-                <w:rFonts w:eastAsia="Times New Roman" w:cstheme="minorHAnsi"/>
-                <w:b/>
-                <w:bCs/>
-                <w:sz w:val="24"/>
-                <w:szCs w:val="24"/>
-              </w:rPr>
-              <w:t>Period</w:t>
-            </w:r>
-          </w:p>
-        </w:tc>
-        <w:tc>
-          <w:tcPr>
-            <w:tcW w:w="4410" w:type="dxa"/>
-          </w:tcPr>
-          <w:p>
-            <w:pPr>
-              <w:jc w:val="center"/>
-              <w:rPr>
-                <w:rFonts w:eastAsia="Times New Roman" w:cstheme="minorHAnsi"/>
-                <w:b/>
-                <w:bCs/>
-                <w:sz w:val="24"/>
-                <w:szCs w:val="24"/>
-              </w:rPr>
-            </w:pPr>
-            <w:r>
-              <w:rPr>
-                <w:rFonts w:eastAsia="Times New Roman" w:cstheme="minorHAnsi"/>
-                <w:b/>
-                <w:bCs/>
-                <w:sz w:val="24"/>
-                <w:szCs w:val="24"/>
-              </w:rPr>
-              <w:t>Funkcionalnost koja se razvija</w:t>
-            </w:r>
-          </w:p>
-        </w:tc>
-      </w:tr>
-      <w:tr>
-        <w:trPr>
-          <w:trHeight w:val="421"/>
-        </w:trPr>
-        <w:tc>
-          <w:tcPr>
-            <w:tcW w:w="1795" w:type="dxa"/>
-            <w:tcBorders>
-              <w:bottom w:val="single" w:sz="4" w:space="0" w:color="auto"/>
-            </w:tcBorders>
-          </w:tcPr>
-          <w:p>
-            <w:pPr>
-              <w:pStyle w:val="ListParagraph"/>
-              <w:numPr>
-                <w:ilvl w:val="0"/>
-                <w:numId w:val="5"/>
-              </w:numPr>
-              <w:spacing w:line="240" w:lineRule="auto"/>
-              <w:rPr>
-                <w:rFonts w:eastAsia="Times New Roman" w:cstheme="minorHAnsi"/>
-                <w:sz w:val="24"/>
-                <w:szCs w:val="24"/>
-              </w:rPr>
-            </w:pPr>
-            <w:r>
-              <w:rPr>
-                <w:rFonts w:eastAsia="Times New Roman" w:cstheme="minorHAnsi"/>
-                <w:sz w:val="24"/>
-                <w:szCs w:val="24"/>
-              </w:rPr>
-              <w:t>Nedelja</w:t>
-            </w:r>
-          </w:p>
-        </w:tc>
-        <w:tc>
-          <w:tcPr>
-            <w:tcW w:w="4410" w:type="dxa"/>
-          </w:tcPr>
-          <w:p>
-            <w:pPr>
-              <w:jc w:val="center"/>
-              <w:rPr>
-                <w:rFonts w:eastAsia="Times New Roman" w:cstheme="minorHAnsi"/>
-                <w:sz w:val="24"/>
-                <w:szCs w:val="24"/>
-              </w:rPr>
-            </w:pPr>
-            <w:r>
-              <w:rPr>
-                <w:rFonts w:eastAsia="Times New Roman" w:cstheme="minorHAnsi"/>
-                <w:sz w:val="24"/>
-                <w:szCs w:val="24"/>
-              </w:rPr>
-              <w:t>Kreiranje baza podataka</w:t>
-            </w:r>
-          </w:p>
-        </w:tc>
-      </w:tr>
-      <w:tr>
-        <w:trPr>
-          <w:trHeight w:val="388"/>
-        </w:trPr>
-        <w:tc>
-          <w:tcPr>
-            <w:tcW w:w="1795" w:type="dxa"/>
-            <w:tcBorders>
-              <w:top w:val="single" w:sz="4" w:space="0" w:color="auto"/>
-            </w:tcBorders>
-          </w:tcPr>
-          <w:p>
-            <w:pPr>
-              <w:pStyle w:val="ListParagraph"/>
-              <w:numPr>
-                <w:ilvl w:val="0"/>
-                <w:numId w:val="5"/>
-              </w:numPr>
-              <w:spacing w:line="240" w:lineRule="auto"/>
-              <w:rPr>
-                <w:rFonts w:eastAsia="Times New Roman" w:cstheme="minorHAnsi"/>
-                <w:sz w:val="24"/>
-                <w:szCs w:val="24"/>
-              </w:rPr>
-            </w:pPr>
-            <w:r>
-              <w:rPr>
-                <w:rFonts w:eastAsia="Times New Roman" w:cstheme="minorHAnsi"/>
-                <w:sz w:val="24"/>
-                <w:szCs w:val="24"/>
-              </w:rPr>
-              <w:t>Nedelja</w:t>
-            </w:r>
-          </w:p>
-        </w:tc>
-        <w:tc>
-          <w:tcPr>
-            <w:tcW w:w="4410" w:type="dxa"/>
-          </w:tcPr>
-          <w:p>
-            <w:pPr>
-              <w:jc w:val="center"/>
-              <w:rPr>
-                <w:rFonts w:eastAsia="Times New Roman" w:cstheme="minorHAnsi"/>
-                <w:sz w:val="24"/>
-                <w:szCs w:val="24"/>
-              </w:rPr>
-            </w:pPr>
-            <w:r>
-              <w:rPr>
-                <w:rFonts w:eastAsia="Times New Roman" w:cstheme="minorHAnsi"/>
-                <w:sz w:val="24"/>
-                <w:szCs w:val="24"/>
-              </w:rPr>
-              <w:t>Implementacija prijave korisnika</w:t>
-            </w:r>
-          </w:p>
-        </w:tc>
-      </w:tr>
-      <w:tr>
-        <w:trPr>
-          <w:trHeight w:val="421"/>
-        </w:trPr>
-        <w:tc>
-          <w:tcPr>
-            <w:tcW w:w="1795" w:type="dxa"/>
-          </w:tcPr>
-          <w:p>
-            <w:pPr>
-              <w:pStyle w:val="ListParagraph"/>
-              <w:numPr>
-                <w:ilvl w:val="0"/>
-                <w:numId w:val="5"/>
-              </w:numPr>
-              <w:spacing w:line="240" w:lineRule="auto"/>
-              <w:rPr>
-                <w:rFonts w:eastAsia="Times New Roman" w:cstheme="minorHAnsi"/>
-                <w:sz w:val="24"/>
-                <w:szCs w:val="24"/>
-              </w:rPr>
-            </w:pPr>
-            <w:r>
-              <w:rPr>
-                <w:rFonts w:eastAsia="Times New Roman" w:cstheme="minorHAnsi"/>
-                <w:sz w:val="24"/>
-                <w:szCs w:val="24"/>
-              </w:rPr>
-              <w:t>Nedelja</w:t>
-            </w:r>
-          </w:p>
-        </w:tc>
-        <w:tc>
-          <w:tcPr>
-            <w:tcW w:w="4410" w:type="dxa"/>
-          </w:tcPr>
-          <w:p>
-            <w:pPr>
-              <w:jc w:val="center"/>
-              <w:rPr>
-                <w:rFonts w:eastAsia="Times New Roman" w:cstheme="minorHAnsi"/>
-                <w:sz w:val="24"/>
-                <w:szCs w:val="24"/>
-              </w:rPr>
-            </w:pPr>
-            <w:r>
-              <w:rPr>
-                <w:rFonts w:eastAsia="Times New Roman" w:cstheme="minorHAnsi"/>
-                <w:sz w:val="24"/>
-                <w:szCs w:val="24"/>
-              </w:rPr>
-              <w:t>Rad sa klijentima I unos zahteva</w:t>
-            </w:r>
-          </w:p>
-        </w:tc>
-      </w:tr>
-      <w:tr>
-        <w:trPr>
-          <w:trHeight w:val="388"/>
-        </w:trPr>
-        <w:tc>
-          <w:tcPr>
-            <w:tcW w:w="1795" w:type="dxa"/>
-          </w:tcPr>
-          <w:p>
-            <w:pPr>
-              <w:pStyle w:val="ListParagraph"/>
-              <w:numPr>
-                <w:ilvl w:val="0"/>
-                <w:numId w:val="5"/>
-              </w:numPr>
-              <w:spacing w:line="240" w:lineRule="auto"/>
-              <w:rPr>
-                <w:rFonts w:eastAsia="Times New Roman" w:cstheme="minorHAnsi"/>
-                <w:sz w:val="24"/>
-                <w:szCs w:val="24"/>
-              </w:rPr>
-            </w:pPr>
-            <w:r>
-              <w:rPr>
-                <w:rFonts w:eastAsia="Times New Roman" w:cstheme="minorHAnsi"/>
-                <w:sz w:val="24"/>
-                <w:szCs w:val="24"/>
-              </w:rPr>
-              <w:t>Nedelja</w:t>
-            </w:r>
-          </w:p>
-        </w:tc>
-        <w:tc>
-          <w:tcPr>
-            <w:tcW w:w="4410" w:type="dxa"/>
-          </w:tcPr>
-          <w:p>
-            <w:pPr>
-              <w:jc w:val="center"/>
-              <w:rPr>
-                <w:rFonts w:eastAsia="Times New Roman" w:cstheme="minorHAnsi"/>
-                <w:sz w:val="24"/>
-                <w:szCs w:val="24"/>
-              </w:rPr>
-            </w:pPr>
-            <w:r>
-              <w:rPr>
-                <w:rFonts w:eastAsia="Times New Roman" w:cstheme="minorHAnsi"/>
-                <w:sz w:val="24"/>
-                <w:szCs w:val="24"/>
-              </w:rPr>
-              <w:t>Kreiranje ponude</w:t>
-            </w:r>
-          </w:p>
-        </w:tc>
-      </w:tr>
-      <w:tr>
-        <w:trPr>
-          <w:trHeight w:val="421"/>
-        </w:trPr>
-        <w:tc>
-          <w:tcPr>
-            <w:tcW w:w="1795" w:type="dxa"/>
-          </w:tcPr>
-          <w:p>
-            <w:pPr>
-              <w:pStyle w:val="ListParagraph"/>
-              <w:numPr>
-                <w:ilvl w:val="0"/>
-                <w:numId w:val="5"/>
-              </w:numPr>
-              <w:spacing w:line="240" w:lineRule="auto"/>
-              <w:rPr>
-                <w:rFonts w:eastAsia="Times New Roman" w:cstheme="minorHAnsi"/>
-                <w:sz w:val="24"/>
-                <w:szCs w:val="24"/>
-              </w:rPr>
-            </w:pPr>
-            <w:r>
-              <w:rPr>
-                <w:rFonts w:eastAsia="Times New Roman" w:cstheme="minorHAnsi"/>
-                <w:sz w:val="24"/>
-                <w:szCs w:val="24"/>
-              </w:rPr>
-              <w:t>Nedelja</w:t>
-            </w:r>
-          </w:p>
-        </w:tc>
-        <w:tc>
-          <w:tcPr>
-            <w:tcW w:w="4410" w:type="dxa"/>
-          </w:tcPr>
-          <w:p>
-            <w:pPr>
-              <w:jc w:val="center"/>
-              <w:rPr>
-                <w:rFonts w:eastAsia="Times New Roman" w:cstheme="minorHAnsi"/>
-                <w:sz w:val="24"/>
-                <w:szCs w:val="24"/>
-              </w:rPr>
-            </w:pPr>
-            <w:r>
-              <w:rPr>
-                <w:rFonts w:eastAsia="Times New Roman" w:cstheme="minorHAnsi"/>
-                <w:sz w:val="24"/>
-                <w:szCs w:val="24"/>
-              </w:rPr>
-              <w:t>Kreiranje rezervacije</w:t>
-            </w:r>
-          </w:p>
-        </w:tc>
-      </w:tr>
-      <w:tr>
-        <w:trPr>
-          <w:trHeight w:val="421"/>
-        </w:trPr>
-        <w:tc>
-          <w:tcPr>
-            <w:tcW w:w="1795" w:type="dxa"/>
-          </w:tcPr>
-          <w:p>
-            <w:pPr>
-              <w:pStyle w:val="ListParagraph"/>
-              <w:numPr>
-                <w:ilvl w:val="0"/>
-                <w:numId w:val="5"/>
-              </w:numPr>
-              <w:spacing w:line="240" w:lineRule="auto"/>
-              <w:rPr>
-                <w:rFonts w:eastAsia="Times New Roman" w:cstheme="minorHAnsi"/>
-                <w:sz w:val="24"/>
-                <w:szCs w:val="24"/>
-              </w:rPr>
-            </w:pPr>
-            <w:r>
-              <w:rPr>
-                <w:rFonts w:eastAsia="Times New Roman" w:cstheme="minorHAnsi"/>
-                <w:sz w:val="24"/>
-                <w:szCs w:val="24"/>
-              </w:rPr>
-              <w:t>Nedelja</w:t>
-            </w:r>
-          </w:p>
-        </w:tc>
-        <w:tc>
-          <w:tcPr>
-            <w:tcW w:w="4410" w:type="dxa"/>
-          </w:tcPr>
-          <w:p>
-            <w:pPr>
-              <w:jc w:val="center"/>
-              <w:rPr>
-                <w:rFonts w:eastAsia="Times New Roman" w:cstheme="minorHAnsi"/>
-                <w:sz w:val="24"/>
-                <w:szCs w:val="24"/>
-              </w:rPr>
-            </w:pPr>
-            <w:r>
-              <w:rPr>
-                <w:rFonts w:eastAsia="Times New Roman" w:cstheme="minorHAnsi"/>
-                <w:sz w:val="24"/>
-                <w:szCs w:val="24"/>
-              </w:rPr>
-              <w:t>Organizacija transportnih tura</w:t>
-            </w:r>
-          </w:p>
-        </w:tc>
-      </w:tr>
-      <w:tr>
-        <w:trPr>
-          <w:trHeight w:val="388"/>
-        </w:trPr>
-        <w:tc>
-          <w:tcPr>
-            <w:tcW w:w="1795" w:type="dxa"/>
-          </w:tcPr>
-          <w:p>
-            <w:pPr>
-              <w:pStyle w:val="ListParagraph"/>
-              <w:numPr>
-                <w:ilvl w:val="0"/>
-                <w:numId w:val="5"/>
-              </w:numPr>
-              <w:spacing w:line="240" w:lineRule="auto"/>
-              <w:rPr>
-                <w:rFonts w:eastAsia="Times New Roman" w:cstheme="minorHAnsi"/>
-                <w:sz w:val="24"/>
-                <w:szCs w:val="24"/>
-              </w:rPr>
-            </w:pPr>
-            <w:r>
-              <w:rPr>
-                <w:rFonts w:eastAsia="Times New Roman" w:cstheme="minorHAnsi"/>
-                <w:sz w:val="24"/>
-                <w:szCs w:val="24"/>
-              </w:rPr>
-              <w:t>Nedelja</w:t>
-            </w:r>
-          </w:p>
-        </w:tc>
-        <w:tc>
-          <w:tcPr>
-            <w:tcW w:w="4410" w:type="dxa"/>
-          </w:tcPr>
-          <w:p>
-            <w:pPr>
-              <w:jc w:val="center"/>
-              <w:rPr>
-                <w:rFonts w:eastAsia="Times New Roman" w:cstheme="minorHAnsi"/>
-                <w:sz w:val="24"/>
-                <w:szCs w:val="24"/>
-              </w:rPr>
-            </w:pPr>
-            <w:r>
-              <w:rPr>
-                <w:rFonts w:eastAsia="Times New Roman" w:cstheme="minorHAnsi"/>
-                <w:sz w:val="24"/>
-                <w:szCs w:val="24"/>
-              </w:rPr>
-              <w:t>Funkcionalnosti vozača</w:t>
-            </w:r>
-          </w:p>
-        </w:tc>
-      </w:tr>
-      <w:tr>
-        <w:trPr>
-          <w:trHeight w:val="421"/>
-        </w:trPr>
-        <w:tc>
-          <w:tcPr>
-            <w:tcW w:w="1795" w:type="dxa"/>
-          </w:tcPr>
-          <w:p>
-            <w:pPr>
-              <w:pStyle w:val="ListParagraph"/>
-              <w:numPr>
-                <w:ilvl w:val="0"/>
-                <w:numId w:val="5"/>
-              </w:numPr>
-              <w:spacing w:line="240" w:lineRule="auto"/>
-              <w:rPr>
-                <w:rFonts w:eastAsia="Times New Roman" w:cstheme="minorHAnsi"/>
-                <w:sz w:val="24"/>
-                <w:szCs w:val="24"/>
-              </w:rPr>
-            </w:pPr>
-            <w:r>
-              <w:rPr>
-                <w:rFonts w:eastAsia="Times New Roman" w:cstheme="minorHAnsi"/>
-                <w:sz w:val="24"/>
-                <w:szCs w:val="24"/>
-              </w:rPr>
-              <w:t>Nedelja</w:t>
-            </w:r>
-          </w:p>
-        </w:tc>
-        <w:tc>
-          <w:tcPr>
-            <w:tcW w:w="4410" w:type="dxa"/>
-          </w:tcPr>
-          <w:p>
-            <w:pPr>
-              <w:jc w:val="center"/>
-              <w:rPr>
-                <w:rFonts w:eastAsia="Times New Roman" w:cstheme="minorHAnsi"/>
-                <w:sz w:val="24"/>
-                <w:szCs w:val="24"/>
-              </w:rPr>
-            </w:pPr>
-            <w:r>
-              <w:rPr>
-                <w:rFonts w:eastAsia="Times New Roman" w:cstheme="minorHAnsi"/>
-                <w:sz w:val="24"/>
-                <w:szCs w:val="24"/>
-              </w:rPr>
-              <w:t>Nadogradnja operative (status I izveštaji)</w:t>
-            </w:r>
-          </w:p>
-        </w:tc>
-      </w:tr>
-      <w:tr>
-        <w:trPr>
-          <w:trHeight w:val="421"/>
-        </w:trPr>
-        <w:tc>
-          <w:tcPr>
-            <w:tcW w:w="1795" w:type="dxa"/>
-          </w:tcPr>
-          <w:p>
-            <w:pPr>
-              <w:pStyle w:val="ListParagraph"/>
-              <w:numPr>
-                <w:ilvl w:val="0"/>
-                <w:numId w:val="5"/>
-              </w:numPr>
-              <w:spacing w:line="240" w:lineRule="auto"/>
-              <w:rPr>
-                <w:rFonts w:eastAsia="Times New Roman" w:cstheme="minorHAnsi"/>
-                <w:sz w:val="24"/>
-                <w:szCs w:val="24"/>
-              </w:rPr>
-            </w:pPr>
-            <w:r>
-              <w:rPr>
-                <w:rFonts w:eastAsia="Times New Roman" w:cstheme="minorHAnsi"/>
-                <w:sz w:val="24"/>
-                <w:szCs w:val="24"/>
-              </w:rPr>
-              <w:t>Nedelja</w:t>
-            </w:r>
-          </w:p>
-        </w:tc>
-        <w:tc>
-          <w:tcPr>
-            <w:tcW w:w="4410" w:type="dxa"/>
-          </w:tcPr>
-          <w:p>
-            <w:pPr>
-              <w:jc w:val="center"/>
-              <w:rPr>
-                <w:rFonts w:eastAsia="Times New Roman" w:cstheme="minorHAnsi"/>
-                <w:sz w:val="24"/>
-                <w:szCs w:val="24"/>
-              </w:rPr>
-            </w:pPr>
-            <w:r>
-              <w:rPr>
-                <w:rFonts w:eastAsia="Times New Roman" w:cstheme="minorHAnsi"/>
-                <w:sz w:val="24"/>
-                <w:szCs w:val="24"/>
-              </w:rPr>
-              <w:t>Testiranje I ispravljanje grešaka</w:t>
-            </w:r>
-          </w:p>
-        </w:tc>
-      </w:tr>
-    </w:tbl>
-    <w:p>
-      <w:pPr>
-        <w:rPr>
-          <w:rFonts w:eastAsia="Times New Roman" w:cstheme="minorHAnsi"/>
-          <w:sz w:val="24"/>
-          <w:szCs w:val="24"/>
-        </w:rPr>
-      </w:pPr>
-    </w:p>
-    <w:p>
-      <w:pPr>
-        <w:rPr>
-          <w:rFonts w:eastAsia="Times New Roman" w:cstheme="minorHAnsi"/>
-          <w:sz w:val="24"/>
-          <w:szCs w:val="24"/>
-        </w:rPr>
-      </w:pPr>
-    </w:p>
-    <w:p>
-      <w:pPr>
-        <w:rPr>
-          <w:rFonts w:eastAsia="Times New Roman" w:cstheme="minorHAnsi"/>
-          <w:sz w:val="24"/>
-          <w:szCs w:val="24"/>
-        </w:rPr>
-      </w:pPr>
-    </w:p>
-    <w:p>
-      <w:pPr>
-        <w:rPr>
-          <w:rFonts w:eastAsia="Times New Roman" w:cstheme="minorHAnsi"/>
-          <w:sz w:val="24"/>
-          <w:szCs w:val="24"/>
-        </w:rPr>
-      </w:pPr>
-    </w:p>
-    <w:p>
-      <w:pPr>
-        <w:rPr>
-          <w:rFonts w:eastAsia="Times New Roman" w:cstheme="minorHAnsi"/>
-          <w:sz w:val="24"/>
-          <w:szCs w:val="24"/>
-        </w:rPr>
-      </w:pPr>
     </w:p>
     <w:p>
       <w:pPr>
@@ -14719,10 +13881,10 @@
           <w:rFonts w:eastAsia="Times New Roman"/>
         </w:rPr>
       </w:pPr>
-      <w:bookmarkStart w:id="62" w:name="_Toc226931161"/>
-      <w:bookmarkStart w:id="63" w:name="_Toc227230549"/>
-      <w:bookmarkStart w:id="64" w:name="_Toc227230604"/>
-      <w:bookmarkStart w:id="65" w:name="_Toc227231934"/>
+      <w:bookmarkStart w:id="61" w:name="_Toc226931161"/>
+      <w:bookmarkStart w:id="62" w:name="_Toc227230549"/>
+      <w:bookmarkStart w:id="63" w:name="_Toc227230604"/>
+      <w:bookmarkStart w:id="64" w:name="_Toc227231934"/>
       <w:r>
         <w:rPr>
           <w:rFonts w:eastAsia="Times New Roman"/>
@@ -14736,10 +13898,10 @@
         </w:rPr>
         <w:t>. Zaključak</w:t>
       </w:r>
+      <w:bookmarkEnd w:id="61"/>
       <w:bookmarkEnd w:id="62"/>
       <w:bookmarkEnd w:id="63"/>
       <w:bookmarkEnd w:id="64"/>
-      <w:bookmarkEnd w:id="65"/>
     </w:p>
     <w:p>
       <w:pPr>

</xml_diff>